<commit_message>
Flytning gennemført: kanoniske placerings-referencer opdateret (06 §4 + 07 §7) + docx-regen
Co-Authored-By: Claude Fable 5 <noreply@anthropic.com>
</commit_message>
<xml_diff>
--- a/drift/07-break-glass-adgang.docx
+++ b/drift/07-break-glass-adgang.docx
@@ -246,7 +246,7 @@
       <w:pPr>
         <w:pStyle w:val="NormalWeb"/>
         <w:shd w:val="clear" w:color="auto" w:fill="F4FAFA"/>
-        <w:divId w:val="1322201382"/>
+        <w:divId w:val="1774742397"/>
         <w:rPr>
           <w:rFonts w:ascii="Calibri" w:hAnsi="Calibri" w:cs="Calibri"/>
           <w:color w:val="333333"/>
@@ -324,7 +324,7 @@
       <w:pPr>
         <w:pStyle w:val="NormalWeb"/>
         <w:shd w:val="clear" w:color="auto" w:fill="F4FAFA"/>
-        <w:divId w:val="1322201382"/>
+        <w:divId w:val="1774742397"/>
         <w:rPr>
           <w:rFonts w:ascii="Calibri" w:hAnsi="Calibri" w:cs="Calibri"/>
           <w:color w:val="333333"/>
@@ -412,7 +412,7 @@
           <w:sz w:val="21"/>
           <w:szCs w:val="21"/>
         </w:rPr>
-        <w:pict w14:anchorId="1DA04CB7">
+        <w:pict w14:anchorId="3369CF4D">
           <v:rect id="_x0000_i1025" style="width:0;height:1.5pt" o:hralign="center" o:hrstd="t" o:hr="t" fillcolor="#a0a0a0" stroked="f"/>
         </w:pict>
       </w:r>
@@ -745,7 +745,7 @@
           <w:sz w:val="21"/>
           <w:szCs w:val="21"/>
         </w:rPr>
-        <w:pict w14:anchorId="29ABC852">
+        <w:pict w14:anchorId="7D427C22">
           <v:rect id="_x0000_i1026" style="width:0;height:1.5pt" o:hralign="center" o:hrstd="t" o:hr="t" fillcolor="#a0a0a0" stroked="f"/>
         </w:pict>
       </w:r>
@@ -2206,7 +2206,7 @@
           <w:sz w:val="21"/>
           <w:szCs w:val="21"/>
         </w:rPr>
-        <w:pict w14:anchorId="3E30C256">
+        <w:pict w14:anchorId="7AA12945">
           <v:rect id="_x0000_i1027" style="width:0;height:1.5pt" o:hralign="center" o:hrstd="t" o:hr="t" fillcolor="#a0a0a0" stroked="f"/>
         </w:pict>
       </w:r>
@@ -2921,7 +2921,7 @@
           <w:sz w:val="21"/>
           <w:szCs w:val="21"/>
         </w:rPr>
-        <w:pict w14:anchorId="6F9C4132">
+        <w:pict w14:anchorId="13B94543">
           <v:rect id="_x0000_i1028" style="width:0;height:1.5pt" o:hralign="center" o:hrstd="t" o:hr="t" fillcolor="#a0a0a0" stroked="f"/>
         </w:pict>
       </w:r>
@@ -3144,7 +3144,7 @@
           <w:sz w:val="21"/>
           <w:szCs w:val="21"/>
         </w:rPr>
-        <w:pict w14:anchorId="587E00D7">
+        <w:pict w14:anchorId="45A2E54B">
           <v:rect id="_x0000_i1029" style="width:0;height:1.5pt" o:hralign="center" o:hrstd="t" o:hr="t" fillcolor="#a0a0a0" stroked="f"/>
         </w:pict>
       </w:r>
@@ -3468,7 +3468,7 @@
           <w:sz w:val="21"/>
           <w:szCs w:val="21"/>
         </w:rPr>
-        <w:pict w14:anchorId="74F324AC">
+        <w:pict w14:anchorId="154352CE">
           <v:rect id="_x0000_i1030" style="width:0;height:1.5pt" o:hralign="center" o:hrstd="t" o:hr="t" fillcolor="#a0a0a0" stroked="f"/>
         </w:pict>
       </w:r>
@@ -4598,7 +4598,7 @@
           <w:sz w:val="21"/>
           <w:szCs w:val="21"/>
         </w:rPr>
-        <w:pict w14:anchorId="2ED2E241">
+        <w:pict w14:anchorId="52CC532B">
           <v:rect id="_x0000_i1031" style="width:0;height:1.5pt" o:hralign="center" o:hrstd="t" o:hr="t" fillcolor="#a0a0a0" stroked="f"/>
         </w:pict>
       </w:r>
@@ -5997,7 +5997,7 @@
           <w:sz w:val="21"/>
           <w:szCs w:val="21"/>
         </w:rPr>
-        <w:pict w14:anchorId="6B3EB68C">
+        <w:pict w14:anchorId="039F8A84">
           <v:rect id="_x0000_i1032" style="width:0;height:1.5pt" o:hralign="center" o:hrstd="t" o:hr="t" fillcolor="#a0a0a0" stroked="f"/>
         </w:pict>
       </w:r>
@@ -6053,23 +6053,7 @@
           <w:b/>
           <w:bCs/>
         </w:rPr>
-        <w:t>_handover/drift/00–06</w:t>
-      </w:r>
-      <w:r>
-        <w:rPr>
-          <w:rFonts w:ascii="Calibri" w:eastAsia="Times New Roman" w:hAnsi="Calibri" w:cs="Calibri"/>
-          <w:sz w:val="21"/>
-          <w:szCs w:val="21"/>
-        </w:rPr>
-        <w:t xml:space="preserve"> — den samlede tekniske driftsmanual for HELE serveren (arkitektur, firewall, CF-lag, alle tre sites, backup, runbooks, gotchas). </w:t>
-      </w:r>
-      <w:r>
-        <w:rPr>
-          <w:rFonts w:ascii="Calibri" w:eastAsia="Times New Roman" w:hAnsi="Calibri" w:cs="Calibri"/>
-          <w:sz w:val="21"/>
-          <w:szCs w:val="21"/>
-        </w:rPr>
-        <w:t xml:space="preserve">Verificeret mod live server + Cloudflare 2026-07-20. </w:t>
+        <w:t>drift/00–06</w:t>
       </w:r>
       <w:r>
         <w:rPr>
@@ -6078,6 +6062,31 @@
           <w:sz w:val="21"/>
           <w:szCs w:val="21"/>
         </w:rPr>
+        <w:t xml:space="preserve"> i dette repo</w:t>
+      </w:r>
+      <w:r>
+        <w:rPr>
+          <w:rFonts w:ascii="Calibri" w:eastAsia="Times New Roman" w:hAnsi="Calibri" w:cs="Calibri"/>
+          <w:sz w:val="21"/>
+          <w:szCs w:val="21"/>
+        </w:rPr>
+        <w:t xml:space="preserve"> — den samlede tekniske driftsmanual for HELE serveren (arkitektur, firewall, CF-lag, alle tre sites, backup, runbooks, </w:t>
+      </w:r>
+      <w:r>
+        <w:rPr>
+          <w:rFonts w:ascii="Calibri" w:eastAsia="Times New Roman" w:hAnsi="Calibri" w:cs="Calibri"/>
+          <w:sz w:val="21"/>
+          <w:szCs w:val="21"/>
+        </w:rPr>
+        <w:t xml:space="preserve">gotchas). Verificeret mod live server + Cloudflare 2026-07-20. </w:t>
+      </w:r>
+      <w:r>
+        <w:rPr>
+          <w:rStyle w:val="Strk"/>
+          <w:rFonts w:ascii="Calibri" w:eastAsia="Times New Roman" w:hAnsi="Calibri" w:cs="Calibri"/>
+          <w:sz w:val="21"/>
+          <w:szCs w:val="21"/>
+        </w:rPr>
         <w:t>Start dér.</w:t>
       </w:r>
       <w:r>
@@ -6086,55 +6095,37 @@
           <w:sz w:val="21"/>
           <w:szCs w:val="21"/>
         </w:rPr>
-        <w:t xml:space="preserve"> </w:t>
-      </w:r>
-      <w:r>
-        <w:rPr>
-          <w:rFonts w:ascii="Segoe UI Emoji" w:eastAsia="Times New Roman" w:hAnsi="Segoe UI Emoji" w:cs="Segoe UI Emoji"/>
-          <w:sz w:val="21"/>
-          <w:szCs w:val="21"/>
-        </w:rPr>
-        <w:t>⚠️</w:t>
-      </w:r>
-      <w:r>
-        <w:rPr>
-          <w:rFonts w:ascii="Calibri" w:eastAsia="Times New Roman" w:hAnsi="Calibri" w:cs="Calibri"/>
-          <w:sz w:val="21"/>
-          <w:szCs w:val="21"/>
-        </w:rPr>
-        <w:t xml:space="preserve"> Ligger pt. kun p</w:t>
-      </w:r>
-      <w:r>
-        <w:rPr>
-          <w:rFonts w:ascii="Calibri" w:eastAsia="Times New Roman" w:hAnsi="Calibri" w:cs="Calibri"/>
-          <w:sz w:val="21"/>
-          <w:szCs w:val="21"/>
-        </w:rPr>
-        <w:t>å</w:t>
-      </w:r>
-      <w:r>
-        <w:rPr>
-          <w:rFonts w:ascii="Calibri" w:eastAsia="Times New Roman" w:hAnsi="Calibri" w:cs="Calibri"/>
-          <w:sz w:val="21"/>
-          <w:szCs w:val="21"/>
-        </w:rPr>
-        <w:t xml:space="preserve"> Johans laptop </w:t>
-      </w:r>
-      <w:r>
-        <w:rPr>
-          <w:rFonts w:ascii="Calibri" w:eastAsia="Times New Roman" w:hAnsi="Calibri" w:cs="Calibri"/>
-          <w:sz w:val="21"/>
-          <w:szCs w:val="21"/>
-        </w:rPr>
-        <w:t>—</w:t>
-      </w:r>
-      <w:r>
-        <w:rPr>
-          <w:rFonts w:ascii="Calibri" w:eastAsia="Times New Roman" w:hAnsi="Calibri" w:cs="Calibri"/>
-          <w:sz w:val="21"/>
-          <w:szCs w:val="21"/>
-        </w:rPr>
-        <w:t xml:space="preserve"> skal versioneres i det private GitHub-repo (åbent punkt), ellers er den utilgængelig i netop det scenarie, dette dokument handler om.</w:t>
+        <w:t xml:space="preserve"> Kanonisk hjem: privat GitHub-repo </w:t>
+      </w:r>
+      <w:r>
+        <w:rPr>
+          <w:rStyle w:val="HTML-kode"/>
+          <w:b/>
+          <w:bCs/>
+        </w:rPr>
+        <w:t>johanjohansen-cbc/cbc-drift</w:t>
+      </w:r>
+      <w:r>
+        <w:rPr>
+          <w:rFonts w:ascii="Calibri" w:eastAsia="Times New Roman" w:hAnsi="Calibri" w:cs="Calibri"/>
+          <w:sz w:val="21"/>
+          <w:szCs w:val="21"/>
+        </w:rPr>
+        <w:t xml:space="preserve"> (dette dokument ligger samme sted — arbejdskopi i </w:t>
+      </w:r>
+      <w:r>
+        <w:rPr>
+          <w:rStyle w:val="HTML-kode"/>
+        </w:rPr>
+        <w:t>app/public/_handover/</w:t>
+      </w:r>
+      <w:r>
+        <w:rPr>
+          <w:rFonts w:ascii="Calibri" w:eastAsia="Times New Roman" w:hAnsi="Calibri" w:cs="Calibri"/>
+          <w:sz w:val="21"/>
+          <w:szCs w:val="21"/>
+        </w:rPr>
+        <w:t xml:space="preserve"> på Johans Local-maskine).</w:t>
       </w:r>
     </w:p>
     <w:p>
@@ -6501,7 +6492,7 @@
           <w:sz w:val="21"/>
           <w:szCs w:val="21"/>
         </w:rPr>
-        <w:pict w14:anchorId="5FEDF804">
+        <w:pict w14:anchorId="1A91A107">
           <v:rect id="_x0000_i1033" style="width:0;height:1.5pt" o:hralign="center" o:hrstd="t" o:hr="t" fillcolor="#a0a0a0" stroked="f"/>
         </w:pict>
       </w:r>
@@ -6741,7 +6732,7 @@
       <w:pPr>
         <w:pStyle w:val="NormalWeb"/>
         <w:shd w:val="clear" w:color="auto" w:fill="F4FAFA"/>
-        <w:divId w:val="1423600776"/>
+        <w:divId w:val="1250849747"/>
         <w:rPr>
           <w:rFonts w:ascii="Calibri" w:hAnsi="Calibri" w:cs="Calibri"/>
           <w:color w:val="333333"/>
@@ -7055,7 +7046,7 @@
           <w:sz w:val="21"/>
           <w:szCs w:val="21"/>
         </w:rPr>
-        <w:pict w14:anchorId="4750A5AB">
+        <w:pict w14:anchorId="5FDB506C">
           <v:rect id="_x0000_i1034" style="width:0;height:1.5pt" o:hralign="center" o:hrstd="t" o:hr="t" fillcolor="#a0a0a0" stroked="f"/>
         </w:pict>
       </w:r>
@@ -7701,7 +7692,7 @@
           <w:sz w:val="21"/>
           <w:szCs w:val="21"/>
         </w:rPr>
-        <w:pict w14:anchorId="7BF06064">
+        <w:pict w14:anchorId="7BA938FD">
           <v:rect id="_x0000_i1035" style="width:0;height:1.5pt" o:hralign="center" o:hrstd="t" o:hr="t" fillcolor="#a0a0a0" stroked="f"/>
         </w:pict>
       </w:r>
@@ -7933,7 +7924,7 @@
           <w:sz w:val="21"/>
           <w:szCs w:val="21"/>
         </w:rPr>
-        <w:pict w14:anchorId="4FAEE346">
+        <w:pict w14:anchorId="25FC487C">
           <v:rect id="_x0000_i1036" style="width:0;height:1.5pt" o:hralign="center" o:hrstd="t" o:hr="t" fillcolor="#a0a0a0" stroked="f"/>
         </w:pict>
       </w:r>
@@ -8191,7 +8182,7 @@
       <w:pPr>
         <w:pStyle w:val="NormalWeb"/>
         <w:shd w:val="clear" w:color="auto" w:fill="F4FAFA"/>
-        <w:divId w:val="1510950386"/>
+        <w:divId w:val="641082660"/>
         <w:rPr>
           <w:rFonts w:ascii="Calibri" w:hAnsi="Calibri" w:cs="Calibri"/>
           <w:color w:val="333333"/>
@@ -8223,7 +8214,7 @@
           <w:sz w:val="21"/>
           <w:szCs w:val="21"/>
         </w:rPr>
-        <w:pict w14:anchorId="0351D385">
+        <w:pict w14:anchorId="5A757937">
           <v:rect id="_x0000_i1037" style="width:0;height:1.5pt" o:hralign="center" o:hrstd="t" o:hr="t" fillcolor="#a0a0a0" stroked="f"/>
         </w:pict>
       </w:r>
@@ -8695,7 +8686,7 @@
           <w:sz w:val="21"/>
           <w:szCs w:val="21"/>
         </w:rPr>
-        <w:pict w14:anchorId="752C35AF">
+        <w:pict w14:anchorId="67B80759">
           <v:rect id="_x0000_i1038" style="width:0;height:1.5pt" o:hralign="center" o:hrstd="t" o:hr="t" fillcolor="#a0a0a0" stroked="f"/>
         </w:pict>
       </w:r>
@@ -8917,9 +8908,9 @@
 <file path=word/numbering.xml><?xml version="1.0" encoding="utf-8"?>
 <w:numbering xmlns:wpc="http://schemas.microsoft.com/office/word/2010/wordprocessingCanvas" xmlns:cx="http://schemas.microsoft.com/office/drawing/2014/chartex" xmlns:cx1="http://schemas.microsoft.com/office/drawing/2015/9/8/chartex" xmlns:cx2="http://schemas.microsoft.com/office/drawing/2015/10/21/chartex" xmlns:cx3="http://schemas.microsoft.com/office/drawing/2016/5/9/chartex" xmlns:cx4="http://schemas.microsoft.com/office/drawing/2016/5/10/chartex" xmlns:cx5="http://schemas.microsoft.com/office/drawing/2016/5/11/chartex" xmlns:cx6="http://schemas.microsoft.com/office/drawing/2016/5/12/chartex" xmlns:cx7="http://schemas.microsoft.com/office/drawing/2016/5/13/chartex" xmlns:cx8="http://schemas.microsoft.com/office/drawing/2016/5/14/chartex" xmlns:mc="http://schemas.openxmlformats.org/markup-compatibility/2006" xmlns:aink="http://schemas.microsoft.com/office/drawing/2016/ink" xmlns:am3d="http://schemas.microsoft.com/office/drawing/2017/model3d" xmlns:o="urn:schemas-microsoft-com:office:office" xmlns:oel="http://schemas.microsoft.com/office/2019/extlst" xmlns:r="http://schemas.openxmlformats.org/officeDocument/2006/relationships" xmlns:m="http://schemas.openxmlformats.org/officeDocument/2006/math" xmlns:v="urn:schemas-microsoft-com:vml" xmlns:wp14="http://schemas.microsoft.com/office/word/2010/wordprocessingDrawing" xmlns:wp="http://schemas.openxmlformats.org/drawingml/2006/wordprocessingDrawing" xmlns:w10="urn:schemas-microsoft-com:office:word" xmlns:w="http://schemas.openxmlformats.org/wordprocessingml/2006/main" xmlns:w14="http://schemas.microsoft.com/office/word/2010/wordml" xmlns:w15="http://schemas.microsoft.com/office/word/2012/wordml" xmlns:w16cex="http://schemas.microsoft.com/office/word/2018/wordml/cex" xmlns:w16cid="http://schemas.microsoft.com/office/word/2016/wordml/cid" xmlns:w16="http://schemas.microsoft.com/office/word/2018/wordml" xmlns:w16du="http://schemas.microsoft.com/office/word/2023/wordml/word16du" xmlns:w16sdtdh="http://schemas.microsoft.com/office/word/2020/wordml/sdtdatahash" xmlns:w16sdtfl="http://schemas.microsoft.com/office/word/2024/wordml/sdtformatlock" xmlns:w16se="http://schemas.microsoft.com/office/word/2015/wordml/symex" xmlns:wpg="http://schemas.microsoft.com/office/word/2010/wordprocessingGroup" xmlns:wpi="http://schemas.microsoft.com/office/word/2010/wordprocessingInk" xmlns:wne="http://schemas.microsoft.com/office/word/2006/wordml" xmlns:wps="http://schemas.microsoft.com/office/word/2010/wordprocessingShape" mc:Ignorable="w14 w15 w16se w16cid w16 w16cex w16sdtdh w16sdtfl w16du wp14">
   <w:abstractNum w:abstractNumId="0" w15:restartNumberingAfterBreak="0">
-    <w:nsid w:val="08113372"/>
+    <w:nsid w:val="03E63552"/>
     <w:multiLevelType w:val="multilevel"/>
-    <w:tmpl w:val="D6B801A6"/>
+    <w:tmpl w:val="A4909FE0"/>
     <w:lvl w:ilvl="0">
       <w:start w:val="1"/>
       <w:numFmt w:val="bullet"/>
@@ -9066,9 +9057,307 @@
     </w:lvl>
   </w:abstractNum>
   <w:abstractNum w:abstractNumId="1" w15:restartNumberingAfterBreak="0">
-    <w:nsid w:val="12904813"/>
+    <w:nsid w:val="0818298E"/>
     <w:multiLevelType w:val="multilevel"/>
-    <w:tmpl w:val="449C812C"/>
+    <w:tmpl w:val="E3E2EC00"/>
+    <w:lvl w:ilvl="0">
+      <w:start w:val="1"/>
+      <w:numFmt w:val="bullet"/>
+      <w:lvlText w:val=""/>
+      <w:lvlJc w:val="left"/>
+      <w:pPr>
+        <w:tabs>
+          <w:tab w:val="num" w:pos="720"/>
+        </w:tabs>
+        <w:ind w:left="720" w:hanging="360"/>
+      </w:pPr>
+      <w:rPr>
+        <w:rFonts w:ascii="Symbol" w:hAnsi="Symbol" w:hint="default"/>
+        <w:sz w:val="20"/>
+      </w:rPr>
+    </w:lvl>
+    <w:lvl w:ilvl="1" w:tentative="1">
+      <w:start w:val="1"/>
+      <w:numFmt w:val="bullet"/>
+      <w:lvlText w:val="o"/>
+      <w:lvlJc w:val="left"/>
+      <w:pPr>
+        <w:tabs>
+          <w:tab w:val="num" w:pos="1440"/>
+        </w:tabs>
+        <w:ind w:left="1440" w:hanging="360"/>
+      </w:pPr>
+      <w:rPr>
+        <w:rFonts w:ascii="Courier New" w:hAnsi="Courier New" w:hint="default"/>
+        <w:sz w:val="20"/>
+      </w:rPr>
+    </w:lvl>
+    <w:lvl w:ilvl="2" w:tentative="1">
+      <w:start w:val="1"/>
+      <w:numFmt w:val="bullet"/>
+      <w:lvlText w:val=""/>
+      <w:lvlJc w:val="left"/>
+      <w:pPr>
+        <w:tabs>
+          <w:tab w:val="num" w:pos="2160"/>
+        </w:tabs>
+        <w:ind w:left="2160" w:hanging="360"/>
+      </w:pPr>
+      <w:rPr>
+        <w:rFonts w:ascii="Wingdings" w:hAnsi="Wingdings" w:hint="default"/>
+        <w:sz w:val="20"/>
+      </w:rPr>
+    </w:lvl>
+    <w:lvl w:ilvl="3" w:tentative="1">
+      <w:start w:val="1"/>
+      <w:numFmt w:val="bullet"/>
+      <w:lvlText w:val=""/>
+      <w:lvlJc w:val="left"/>
+      <w:pPr>
+        <w:tabs>
+          <w:tab w:val="num" w:pos="2880"/>
+        </w:tabs>
+        <w:ind w:left="2880" w:hanging="360"/>
+      </w:pPr>
+      <w:rPr>
+        <w:rFonts w:ascii="Wingdings" w:hAnsi="Wingdings" w:hint="default"/>
+        <w:sz w:val="20"/>
+      </w:rPr>
+    </w:lvl>
+    <w:lvl w:ilvl="4" w:tentative="1">
+      <w:start w:val="1"/>
+      <w:numFmt w:val="bullet"/>
+      <w:lvlText w:val=""/>
+      <w:lvlJc w:val="left"/>
+      <w:pPr>
+        <w:tabs>
+          <w:tab w:val="num" w:pos="3600"/>
+        </w:tabs>
+        <w:ind w:left="3600" w:hanging="360"/>
+      </w:pPr>
+      <w:rPr>
+        <w:rFonts w:ascii="Wingdings" w:hAnsi="Wingdings" w:hint="default"/>
+        <w:sz w:val="20"/>
+      </w:rPr>
+    </w:lvl>
+    <w:lvl w:ilvl="5" w:tentative="1">
+      <w:start w:val="1"/>
+      <w:numFmt w:val="bullet"/>
+      <w:lvlText w:val=""/>
+      <w:lvlJc w:val="left"/>
+      <w:pPr>
+        <w:tabs>
+          <w:tab w:val="num" w:pos="4320"/>
+        </w:tabs>
+        <w:ind w:left="4320" w:hanging="360"/>
+      </w:pPr>
+      <w:rPr>
+        <w:rFonts w:ascii="Wingdings" w:hAnsi="Wingdings" w:hint="default"/>
+        <w:sz w:val="20"/>
+      </w:rPr>
+    </w:lvl>
+    <w:lvl w:ilvl="6" w:tentative="1">
+      <w:start w:val="1"/>
+      <w:numFmt w:val="bullet"/>
+      <w:lvlText w:val=""/>
+      <w:lvlJc w:val="left"/>
+      <w:pPr>
+        <w:tabs>
+          <w:tab w:val="num" w:pos="5040"/>
+        </w:tabs>
+        <w:ind w:left="5040" w:hanging="360"/>
+      </w:pPr>
+      <w:rPr>
+        <w:rFonts w:ascii="Wingdings" w:hAnsi="Wingdings" w:hint="default"/>
+        <w:sz w:val="20"/>
+      </w:rPr>
+    </w:lvl>
+    <w:lvl w:ilvl="7" w:tentative="1">
+      <w:start w:val="1"/>
+      <w:numFmt w:val="bullet"/>
+      <w:lvlText w:val=""/>
+      <w:lvlJc w:val="left"/>
+      <w:pPr>
+        <w:tabs>
+          <w:tab w:val="num" w:pos="5760"/>
+        </w:tabs>
+        <w:ind w:left="5760" w:hanging="360"/>
+      </w:pPr>
+      <w:rPr>
+        <w:rFonts w:ascii="Wingdings" w:hAnsi="Wingdings" w:hint="default"/>
+        <w:sz w:val="20"/>
+      </w:rPr>
+    </w:lvl>
+    <w:lvl w:ilvl="8" w:tentative="1">
+      <w:start w:val="1"/>
+      <w:numFmt w:val="bullet"/>
+      <w:lvlText w:val=""/>
+      <w:lvlJc w:val="left"/>
+      <w:pPr>
+        <w:tabs>
+          <w:tab w:val="num" w:pos="6480"/>
+        </w:tabs>
+        <w:ind w:left="6480" w:hanging="360"/>
+      </w:pPr>
+      <w:rPr>
+        <w:rFonts w:ascii="Wingdings" w:hAnsi="Wingdings" w:hint="default"/>
+        <w:sz w:val="20"/>
+      </w:rPr>
+    </w:lvl>
+  </w:abstractNum>
+  <w:abstractNum w:abstractNumId="2" w15:restartNumberingAfterBreak="0">
+    <w:nsid w:val="0EBA2749"/>
+    <w:multiLevelType w:val="multilevel"/>
+    <w:tmpl w:val="CAF8076A"/>
+    <w:lvl w:ilvl="0">
+      <w:start w:val="1"/>
+      <w:numFmt w:val="bullet"/>
+      <w:lvlText w:val=""/>
+      <w:lvlJc w:val="left"/>
+      <w:pPr>
+        <w:tabs>
+          <w:tab w:val="num" w:pos="720"/>
+        </w:tabs>
+        <w:ind w:left="720" w:hanging="360"/>
+      </w:pPr>
+      <w:rPr>
+        <w:rFonts w:ascii="Symbol" w:hAnsi="Symbol" w:hint="default"/>
+        <w:sz w:val="20"/>
+      </w:rPr>
+    </w:lvl>
+    <w:lvl w:ilvl="1" w:tentative="1">
+      <w:start w:val="1"/>
+      <w:numFmt w:val="bullet"/>
+      <w:lvlText w:val="o"/>
+      <w:lvlJc w:val="left"/>
+      <w:pPr>
+        <w:tabs>
+          <w:tab w:val="num" w:pos="1440"/>
+        </w:tabs>
+        <w:ind w:left="1440" w:hanging="360"/>
+      </w:pPr>
+      <w:rPr>
+        <w:rFonts w:ascii="Courier New" w:hAnsi="Courier New" w:hint="default"/>
+        <w:sz w:val="20"/>
+      </w:rPr>
+    </w:lvl>
+    <w:lvl w:ilvl="2" w:tentative="1">
+      <w:start w:val="1"/>
+      <w:numFmt w:val="bullet"/>
+      <w:lvlText w:val=""/>
+      <w:lvlJc w:val="left"/>
+      <w:pPr>
+        <w:tabs>
+          <w:tab w:val="num" w:pos="2160"/>
+        </w:tabs>
+        <w:ind w:left="2160" w:hanging="360"/>
+      </w:pPr>
+      <w:rPr>
+        <w:rFonts w:ascii="Wingdings" w:hAnsi="Wingdings" w:hint="default"/>
+        <w:sz w:val="20"/>
+      </w:rPr>
+    </w:lvl>
+    <w:lvl w:ilvl="3" w:tentative="1">
+      <w:start w:val="1"/>
+      <w:numFmt w:val="bullet"/>
+      <w:lvlText w:val=""/>
+      <w:lvlJc w:val="left"/>
+      <w:pPr>
+        <w:tabs>
+          <w:tab w:val="num" w:pos="2880"/>
+        </w:tabs>
+        <w:ind w:left="2880" w:hanging="360"/>
+      </w:pPr>
+      <w:rPr>
+        <w:rFonts w:ascii="Wingdings" w:hAnsi="Wingdings" w:hint="default"/>
+        <w:sz w:val="20"/>
+      </w:rPr>
+    </w:lvl>
+    <w:lvl w:ilvl="4" w:tentative="1">
+      <w:start w:val="1"/>
+      <w:numFmt w:val="bullet"/>
+      <w:lvlText w:val=""/>
+      <w:lvlJc w:val="left"/>
+      <w:pPr>
+        <w:tabs>
+          <w:tab w:val="num" w:pos="3600"/>
+        </w:tabs>
+        <w:ind w:left="3600" w:hanging="360"/>
+      </w:pPr>
+      <w:rPr>
+        <w:rFonts w:ascii="Wingdings" w:hAnsi="Wingdings" w:hint="default"/>
+        <w:sz w:val="20"/>
+      </w:rPr>
+    </w:lvl>
+    <w:lvl w:ilvl="5" w:tentative="1">
+      <w:start w:val="1"/>
+      <w:numFmt w:val="bullet"/>
+      <w:lvlText w:val=""/>
+      <w:lvlJc w:val="left"/>
+      <w:pPr>
+        <w:tabs>
+          <w:tab w:val="num" w:pos="4320"/>
+        </w:tabs>
+        <w:ind w:left="4320" w:hanging="360"/>
+      </w:pPr>
+      <w:rPr>
+        <w:rFonts w:ascii="Wingdings" w:hAnsi="Wingdings" w:hint="default"/>
+        <w:sz w:val="20"/>
+      </w:rPr>
+    </w:lvl>
+    <w:lvl w:ilvl="6" w:tentative="1">
+      <w:start w:val="1"/>
+      <w:numFmt w:val="bullet"/>
+      <w:lvlText w:val=""/>
+      <w:lvlJc w:val="left"/>
+      <w:pPr>
+        <w:tabs>
+          <w:tab w:val="num" w:pos="5040"/>
+        </w:tabs>
+        <w:ind w:left="5040" w:hanging="360"/>
+      </w:pPr>
+      <w:rPr>
+        <w:rFonts w:ascii="Wingdings" w:hAnsi="Wingdings" w:hint="default"/>
+        <w:sz w:val="20"/>
+      </w:rPr>
+    </w:lvl>
+    <w:lvl w:ilvl="7" w:tentative="1">
+      <w:start w:val="1"/>
+      <w:numFmt w:val="bullet"/>
+      <w:lvlText w:val=""/>
+      <w:lvlJc w:val="left"/>
+      <w:pPr>
+        <w:tabs>
+          <w:tab w:val="num" w:pos="5760"/>
+        </w:tabs>
+        <w:ind w:left="5760" w:hanging="360"/>
+      </w:pPr>
+      <w:rPr>
+        <w:rFonts w:ascii="Wingdings" w:hAnsi="Wingdings" w:hint="default"/>
+        <w:sz w:val="20"/>
+      </w:rPr>
+    </w:lvl>
+    <w:lvl w:ilvl="8" w:tentative="1">
+      <w:start w:val="1"/>
+      <w:numFmt w:val="bullet"/>
+      <w:lvlText w:val=""/>
+      <w:lvlJc w:val="left"/>
+      <w:pPr>
+        <w:tabs>
+          <w:tab w:val="num" w:pos="6480"/>
+        </w:tabs>
+        <w:ind w:left="6480" w:hanging="360"/>
+      </w:pPr>
+      <w:rPr>
+        <w:rFonts w:ascii="Wingdings" w:hAnsi="Wingdings" w:hint="default"/>
+        <w:sz w:val="20"/>
+      </w:rPr>
+    </w:lvl>
+  </w:abstractNum>
+  <w:abstractNum w:abstractNumId="3" w15:restartNumberingAfterBreak="0">
+    <w:nsid w:val="1F2036EF"/>
+    <w:multiLevelType w:val="multilevel"/>
+    <w:tmpl w:val="70F6226E"/>
     <w:lvl w:ilvl="0">
       <w:start w:val="1"/>
       <w:numFmt w:val="decimal"/>
@@ -9178,10 +9467,10 @@
       </w:pPr>
     </w:lvl>
   </w:abstractNum>
-  <w:abstractNum w:abstractNumId="2" w15:restartNumberingAfterBreak="0">
-    <w:nsid w:val="1A933ECC"/>
+  <w:abstractNum w:abstractNumId="4" w15:restartNumberingAfterBreak="0">
+    <w:nsid w:val="25E15167"/>
     <w:multiLevelType w:val="multilevel"/>
-    <w:tmpl w:val="CACEC87E"/>
+    <w:tmpl w:val="35148EA2"/>
     <w:lvl w:ilvl="0">
       <w:start w:val="1"/>
       <w:numFmt w:val="bullet"/>
@@ -9327,10 +9616,123 @@
       </w:rPr>
     </w:lvl>
   </w:abstractNum>
-  <w:abstractNum w:abstractNumId="3" w15:restartNumberingAfterBreak="0">
-    <w:nsid w:val="29AD0993"/>
+  <w:abstractNum w:abstractNumId="5" w15:restartNumberingAfterBreak="0">
+    <w:nsid w:val="26193B95"/>
     <w:multiLevelType w:val="multilevel"/>
-    <w:tmpl w:val="D9BC813E"/>
+    <w:tmpl w:val="E11A331E"/>
+    <w:lvl w:ilvl="0">
+      <w:start w:val="1"/>
+      <w:numFmt w:val="decimal"/>
+      <w:lvlText w:val="%1."/>
+      <w:lvlJc w:val="left"/>
+      <w:pPr>
+        <w:tabs>
+          <w:tab w:val="num" w:pos="720"/>
+        </w:tabs>
+        <w:ind w:left="720" w:hanging="360"/>
+      </w:pPr>
+    </w:lvl>
+    <w:lvl w:ilvl="1" w:tentative="1">
+      <w:start w:val="1"/>
+      <w:numFmt w:val="decimal"/>
+      <w:lvlText w:val="%2."/>
+      <w:lvlJc w:val="left"/>
+      <w:pPr>
+        <w:tabs>
+          <w:tab w:val="num" w:pos="1440"/>
+        </w:tabs>
+        <w:ind w:left="1440" w:hanging="360"/>
+      </w:pPr>
+    </w:lvl>
+    <w:lvl w:ilvl="2" w:tentative="1">
+      <w:start w:val="1"/>
+      <w:numFmt w:val="decimal"/>
+      <w:lvlText w:val="%3."/>
+      <w:lvlJc w:val="left"/>
+      <w:pPr>
+        <w:tabs>
+          <w:tab w:val="num" w:pos="2160"/>
+        </w:tabs>
+        <w:ind w:left="2160" w:hanging="360"/>
+      </w:pPr>
+    </w:lvl>
+    <w:lvl w:ilvl="3" w:tentative="1">
+      <w:start w:val="1"/>
+      <w:numFmt w:val="decimal"/>
+      <w:lvlText w:val="%4."/>
+      <w:lvlJc w:val="left"/>
+      <w:pPr>
+        <w:tabs>
+          <w:tab w:val="num" w:pos="2880"/>
+        </w:tabs>
+        <w:ind w:left="2880" w:hanging="360"/>
+      </w:pPr>
+    </w:lvl>
+    <w:lvl w:ilvl="4" w:tentative="1">
+      <w:start w:val="1"/>
+      <w:numFmt w:val="decimal"/>
+      <w:lvlText w:val="%5."/>
+      <w:lvlJc w:val="left"/>
+      <w:pPr>
+        <w:tabs>
+          <w:tab w:val="num" w:pos="3600"/>
+        </w:tabs>
+        <w:ind w:left="3600" w:hanging="360"/>
+      </w:pPr>
+    </w:lvl>
+    <w:lvl w:ilvl="5" w:tentative="1">
+      <w:start w:val="1"/>
+      <w:numFmt w:val="decimal"/>
+      <w:lvlText w:val="%6."/>
+      <w:lvlJc w:val="left"/>
+      <w:pPr>
+        <w:tabs>
+          <w:tab w:val="num" w:pos="4320"/>
+        </w:tabs>
+        <w:ind w:left="4320" w:hanging="360"/>
+      </w:pPr>
+    </w:lvl>
+    <w:lvl w:ilvl="6" w:tentative="1">
+      <w:start w:val="1"/>
+      <w:numFmt w:val="decimal"/>
+      <w:lvlText w:val="%7."/>
+      <w:lvlJc w:val="left"/>
+      <w:pPr>
+        <w:tabs>
+          <w:tab w:val="num" w:pos="5040"/>
+        </w:tabs>
+        <w:ind w:left="5040" w:hanging="360"/>
+      </w:pPr>
+    </w:lvl>
+    <w:lvl w:ilvl="7" w:tentative="1">
+      <w:start w:val="1"/>
+      <w:numFmt w:val="decimal"/>
+      <w:lvlText w:val="%8."/>
+      <w:lvlJc w:val="left"/>
+      <w:pPr>
+        <w:tabs>
+          <w:tab w:val="num" w:pos="5760"/>
+        </w:tabs>
+        <w:ind w:left="5760" w:hanging="360"/>
+      </w:pPr>
+    </w:lvl>
+    <w:lvl w:ilvl="8" w:tentative="1">
+      <w:start w:val="1"/>
+      <w:numFmt w:val="decimal"/>
+      <w:lvlText w:val="%9."/>
+      <w:lvlJc w:val="left"/>
+      <w:pPr>
+        <w:tabs>
+          <w:tab w:val="num" w:pos="6480"/>
+        </w:tabs>
+        <w:ind w:left="6480" w:hanging="360"/>
+      </w:pPr>
+    </w:lvl>
+  </w:abstractNum>
+  <w:abstractNum w:abstractNumId="6" w15:restartNumberingAfterBreak="0">
+    <w:nsid w:val="2A035F0C"/>
+    <w:multiLevelType w:val="multilevel"/>
+    <w:tmpl w:val="400A3CE8"/>
     <w:lvl w:ilvl="0">
       <w:start w:val="1"/>
       <w:numFmt w:val="bullet"/>
@@ -9476,10 +9878,10 @@
       </w:rPr>
     </w:lvl>
   </w:abstractNum>
-  <w:abstractNum w:abstractNumId="4" w15:restartNumberingAfterBreak="0">
-    <w:nsid w:val="34B8371B"/>
+  <w:abstractNum w:abstractNumId="7" w15:restartNumberingAfterBreak="0">
+    <w:nsid w:val="3F8803E8"/>
     <w:multiLevelType w:val="multilevel"/>
-    <w:tmpl w:val="7112300A"/>
+    <w:tmpl w:val="21DC36D4"/>
     <w:lvl w:ilvl="0">
       <w:start w:val="1"/>
       <w:numFmt w:val="decimal"/>
@@ -9589,10 +9991,123 @@
       </w:pPr>
     </w:lvl>
   </w:abstractNum>
-  <w:abstractNum w:abstractNumId="5" w15:restartNumberingAfterBreak="0">
-    <w:nsid w:val="36D7111E"/>
+  <w:abstractNum w:abstractNumId="8" w15:restartNumberingAfterBreak="0">
+    <w:nsid w:val="54A166B7"/>
     <w:multiLevelType w:val="multilevel"/>
-    <w:tmpl w:val="B3ECFDB2"/>
+    <w:tmpl w:val="FB44E708"/>
+    <w:lvl w:ilvl="0">
+      <w:start w:val="1"/>
+      <w:numFmt w:val="decimal"/>
+      <w:lvlText w:val="%1."/>
+      <w:lvlJc w:val="left"/>
+      <w:pPr>
+        <w:tabs>
+          <w:tab w:val="num" w:pos="720"/>
+        </w:tabs>
+        <w:ind w:left="720" w:hanging="360"/>
+      </w:pPr>
+    </w:lvl>
+    <w:lvl w:ilvl="1" w:tentative="1">
+      <w:start w:val="1"/>
+      <w:numFmt w:val="decimal"/>
+      <w:lvlText w:val="%2."/>
+      <w:lvlJc w:val="left"/>
+      <w:pPr>
+        <w:tabs>
+          <w:tab w:val="num" w:pos="1440"/>
+        </w:tabs>
+        <w:ind w:left="1440" w:hanging="360"/>
+      </w:pPr>
+    </w:lvl>
+    <w:lvl w:ilvl="2" w:tentative="1">
+      <w:start w:val="1"/>
+      <w:numFmt w:val="decimal"/>
+      <w:lvlText w:val="%3."/>
+      <w:lvlJc w:val="left"/>
+      <w:pPr>
+        <w:tabs>
+          <w:tab w:val="num" w:pos="2160"/>
+        </w:tabs>
+        <w:ind w:left="2160" w:hanging="360"/>
+      </w:pPr>
+    </w:lvl>
+    <w:lvl w:ilvl="3" w:tentative="1">
+      <w:start w:val="1"/>
+      <w:numFmt w:val="decimal"/>
+      <w:lvlText w:val="%4."/>
+      <w:lvlJc w:val="left"/>
+      <w:pPr>
+        <w:tabs>
+          <w:tab w:val="num" w:pos="2880"/>
+        </w:tabs>
+        <w:ind w:left="2880" w:hanging="360"/>
+      </w:pPr>
+    </w:lvl>
+    <w:lvl w:ilvl="4" w:tentative="1">
+      <w:start w:val="1"/>
+      <w:numFmt w:val="decimal"/>
+      <w:lvlText w:val="%5."/>
+      <w:lvlJc w:val="left"/>
+      <w:pPr>
+        <w:tabs>
+          <w:tab w:val="num" w:pos="3600"/>
+        </w:tabs>
+        <w:ind w:left="3600" w:hanging="360"/>
+      </w:pPr>
+    </w:lvl>
+    <w:lvl w:ilvl="5" w:tentative="1">
+      <w:start w:val="1"/>
+      <w:numFmt w:val="decimal"/>
+      <w:lvlText w:val="%6."/>
+      <w:lvlJc w:val="left"/>
+      <w:pPr>
+        <w:tabs>
+          <w:tab w:val="num" w:pos="4320"/>
+        </w:tabs>
+        <w:ind w:left="4320" w:hanging="360"/>
+      </w:pPr>
+    </w:lvl>
+    <w:lvl w:ilvl="6" w:tentative="1">
+      <w:start w:val="1"/>
+      <w:numFmt w:val="decimal"/>
+      <w:lvlText w:val="%7."/>
+      <w:lvlJc w:val="left"/>
+      <w:pPr>
+        <w:tabs>
+          <w:tab w:val="num" w:pos="5040"/>
+        </w:tabs>
+        <w:ind w:left="5040" w:hanging="360"/>
+      </w:pPr>
+    </w:lvl>
+    <w:lvl w:ilvl="7" w:tentative="1">
+      <w:start w:val="1"/>
+      <w:numFmt w:val="decimal"/>
+      <w:lvlText w:val="%8."/>
+      <w:lvlJc w:val="left"/>
+      <w:pPr>
+        <w:tabs>
+          <w:tab w:val="num" w:pos="5760"/>
+        </w:tabs>
+        <w:ind w:left="5760" w:hanging="360"/>
+      </w:pPr>
+    </w:lvl>
+    <w:lvl w:ilvl="8" w:tentative="1">
+      <w:start w:val="1"/>
+      <w:numFmt w:val="decimal"/>
+      <w:lvlText w:val="%9."/>
+      <w:lvlJc w:val="left"/>
+      <w:pPr>
+        <w:tabs>
+          <w:tab w:val="num" w:pos="6480"/>
+        </w:tabs>
+        <w:ind w:left="6480" w:hanging="360"/>
+      </w:pPr>
+    </w:lvl>
+  </w:abstractNum>
+  <w:abstractNum w:abstractNumId="9" w15:restartNumberingAfterBreak="0">
+    <w:nsid w:val="55C65BD9"/>
+    <w:multiLevelType w:val="multilevel"/>
+    <w:tmpl w:val="C2F49C78"/>
     <w:lvl w:ilvl="0">
       <w:start w:val="1"/>
       <w:numFmt w:val="bullet"/>
@@ -9738,10 +10253,1202 @@
       </w:rPr>
     </w:lvl>
   </w:abstractNum>
-  <w:abstractNum w:abstractNumId="6" w15:restartNumberingAfterBreak="0">
-    <w:nsid w:val="39F52C1E"/>
+  <w:abstractNum w:abstractNumId="10" w15:restartNumberingAfterBreak="0">
+    <w:nsid w:val="569B3C20"/>
     <w:multiLevelType w:val="multilevel"/>
-    <w:tmpl w:val="7820CBEE"/>
+    <w:tmpl w:val="C8120604"/>
+    <w:lvl w:ilvl="0">
+      <w:start w:val="1"/>
+      <w:numFmt w:val="bullet"/>
+      <w:lvlText w:val=""/>
+      <w:lvlJc w:val="left"/>
+      <w:pPr>
+        <w:tabs>
+          <w:tab w:val="num" w:pos="720"/>
+        </w:tabs>
+        <w:ind w:left="720" w:hanging="360"/>
+      </w:pPr>
+      <w:rPr>
+        <w:rFonts w:ascii="Symbol" w:hAnsi="Symbol" w:hint="default"/>
+        <w:sz w:val="20"/>
+      </w:rPr>
+    </w:lvl>
+    <w:lvl w:ilvl="1" w:tentative="1">
+      <w:start w:val="1"/>
+      <w:numFmt w:val="bullet"/>
+      <w:lvlText w:val="o"/>
+      <w:lvlJc w:val="left"/>
+      <w:pPr>
+        <w:tabs>
+          <w:tab w:val="num" w:pos="1440"/>
+        </w:tabs>
+        <w:ind w:left="1440" w:hanging="360"/>
+      </w:pPr>
+      <w:rPr>
+        <w:rFonts w:ascii="Courier New" w:hAnsi="Courier New" w:hint="default"/>
+        <w:sz w:val="20"/>
+      </w:rPr>
+    </w:lvl>
+    <w:lvl w:ilvl="2" w:tentative="1">
+      <w:start w:val="1"/>
+      <w:numFmt w:val="bullet"/>
+      <w:lvlText w:val=""/>
+      <w:lvlJc w:val="left"/>
+      <w:pPr>
+        <w:tabs>
+          <w:tab w:val="num" w:pos="2160"/>
+        </w:tabs>
+        <w:ind w:left="2160" w:hanging="360"/>
+      </w:pPr>
+      <w:rPr>
+        <w:rFonts w:ascii="Wingdings" w:hAnsi="Wingdings" w:hint="default"/>
+        <w:sz w:val="20"/>
+      </w:rPr>
+    </w:lvl>
+    <w:lvl w:ilvl="3" w:tentative="1">
+      <w:start w:val="1"/>
+      <w:numFmt w:val="bullet"/>
+      <w:lvlText w:val=""/>
+      <w:lvlJc w:val="left"/>
+      <w:pPr>
+        <w:tabs>
+          <w:tab w:val="num" w:pos="2880"/>
+        </w:tabs>
+        <w:ind w:left="2880" w:hanging="360"/>
+      </w:pPr>
+      <w:rPr>
+        <w:rFonts w:ascii="Wingdings" w:hAnsi="Wingdings" w:hint="default"/>
+        <w:sz w:val="20"/>
+      </w:rPr>
+    </w:lvl>
+    <w:lvl w:ilvl="4" w:tentative="1">
+      <w:start w:val="1"/>
+      <w:numFmt w:val="bullet"/>
+      <w:lvlText w:val=""/>
+      <w:lvlJc w:val="left"/>
+      <w:pPr>
+        <w:tabs>
+          <w:tab w:val="num" w:pos="3600"/>
+        </w:tabs>
+        <w:ind w:left="3600" w:hanging="360"/>
+      </w:pPr>
+      <w:rPr>
+        <w:rFonts w:ascii="Wingdings" w:hAnsi="Wingdings" w:hint="default"/>
+        <w:sz w:val="20"/>
+      </w:rPr>
+    </w:lvl>
+    <w:lvl w:ilvl="5" w:tentative="1">
+      <w:start w:val="1"/>
+      <w:numFmt w:val="bullet"/>
+      <w:lvlText w:val=""/>
+      <w:lvlJc w:val="left"/>
+      <w:pPr>
+        <w:tabs>
+          <w:tab w:val="num" w:pos="4320"/>
+        </w:tabs>
+        <w:ind w:left="4320" w:hanging="360"/>
+      </w:pPr>
+      <w:rPr>
+        <w:rFonts w:ascii="Wingdings" w:hAnsi="Wingdings" w:hint="default"/>
+        <w:sz w:val="20"/>
+      </w:rPr>
+    </w:lvl>
+    <w:lvl w:ilvl="6" w:tentative="1">
+      <w:start w:val="1"/>
+      <w:numFmt w:val="bullet"/>
+      <w:lvlText w:val=""/>
+      <w:lvlJc w:val="left"/>
+      <w:pPr>
+        <w:tabs>
+          <w:tab w:val="num" w:pos="5040"/>
+        </w:tabs>
+        <w:ind w:left="5040" w:hanging="360"/>
+      </w:pPr>
+      <w:rPr>
+        <w:rFonts w:ascii="Wingdings" w:hAnsi="Wingdings" w:hint="default"/>
+        <w:sz w:val="20"/>
+      </w:rPr>
+    </w:lvl>
+    <w:lvl w:ilvl="7" w:tentative="1">
+      <w:start w:val="1"/>
+      <w:numFmt w:val="bullet"/>
+      <w:lvlText w:val=""/>
+      <w:lvlJc w:val="left"/>
+      <w:pPr>
+        <w:tabs>
+          <w:tab w:val="num" w:pos="5760"/>
+        </w:tabs>
+        <w:ind w:left="5760" w:hanging="360"/>
+      </w:pPr>
+      <w:rPr>
+        <w:rFonts w:ascii="Wingdings" w:hAnsi="Wingdings" w:hint="default"/>
+        <w:sz w:val="20"/>
+      </w:rPr>
+    </w:lvl>
+    <w:lvl w:ilvl="8" w:tentative="1">
+      <w:start w:val="1"/>
+      <w:numFmt w:val="bullet"/>
+      <w:lvlText w:val=""/>
+      <w:lvlJc w:val="left"/>
+      <w:pPr>
+        <w:tabs>
+          <w:tab w:val="num" w:pos="6480"/>
+        </w:tabs>
+        <w:ind w:left="6480" w:hanging="360"/>
+      </w:pPr>
+      <w:rPr>
+        <w:rFonts w:ascii="Wingdings" w:hAnsi="Wingdings" w:hint="default"/>
+        <w:sz w:val="20"/>
+      </w:rPr>
+    </w:lvl>
+  </w:abstractNum>
+  <w:abstractNum w:abstractNumId="11" w15:restartNumberingAfterBreak="0">
+    <w:nsid w:val="59C057F0"/>
+    <w:multiLevelType w:val="multilevel"/>
+    <w:tmpl w:val="A05694E0"/>
+    <w:lvl w:ilvl="0">
+      <w:start w:val="1"/>
+      <w:numFmt w:val="bullet"/>
+      <w:lvlText w:val=""/>
+      <w:lvlJc w:val="left"/>
+      <w:pPr>
+        <w:tabs>
+          <w:tab w:val="num" w:pos="720"/>
+        </w:tabs>
+        <w:ind w:left="720" w:hanging="360"/>
+      </w:pPr>
+      <w:rPr>
+        <w:rFonts w:ascii="Symbol" w:hAnsi="Symbol" w:hint="default"/>
+        <w:sz w:val="20"/>
+      </w:rPr>
+    </w:lvl>
+    <w:lvl w:ilvl="1" w:tentative="1">
+      <w:start w:val="1"/>
+      <w:numFmt w:val="bullet"/>
+      <w:lvlText w:val="o"/>
+      <w:lvlJc w:val="left"/>
+      <w:pPr>
+        <w:tabs>
+          <w:tab w:val="num" w:pos="1440"/>
+        </w:tabs>
+        <w:ind w:left="1440" w:hanging="360"/>
+      </w:pPr>
+      <w:rPr>
+        <w:rFonts w:ascii="Courier New" w:hAnsi="Courier New" w:hint="default"/>
+        <w:sz w:val="20"/>
+      </w:rPr>
+    </w:lvl>
+    <w:lvl w:ilvl="2" w:tentative="1">
+      <w:start w:val="1"/>
+      <w:numFmt w:val="bullet"/>
+      <w:lvlText w:val=""/>
+      <w:lvlJc w:val="left"/>
+      <w:pPr>
+        <w:tabs>
+          <w:tab w:val="num" w:pos="2160"/>
+        </w:tabs>
+        <w:ind w:left="2160" w:hanging="360"/>
+      </w:pPr>
+      <w:rPr>
+        <w:rFonts w:ascii="Wingdings" w:hAnsi="Wingdings" w:hint="default"/>
+        <w:sz w:val="20"/>
+      </w:rPr>
+    </w:lvl>
+    <w:lvl w:ilvl="3" w:tentative="1">
+      <w:start w:val="1"/>
+      <w:numFmt w:val="bullet"/>
+      <w:lvlText w:val=""/>
+      <w:lvlJc w:val="left"/>
+      <w:pPr>
+        <w:tabs>
+          <w:tab w:val="num" w:pos="2880"/>
+        </w:tabs>
+        <w:ind w:left="2880" w:hanging="360"/>
+      </w:pPr>
+      <w:rPr>
+        <w:rFonts w:ascii="Wingdings" w:hAnsi="Wingdings" w:hint="default"/>
+        <w:sz w:val="20"/>
+      </w:rPr>
+    </w:lvl>
+    <w:lvl w:ilvl="4" w:tentative="1">
+      <w:start w:val="1"/>
+      <w:numFmt w:val="bullet"/>
+      <w:lvlText w:val=""/>
+      <w:lvlJc w:val="left"/>
+      <w:pPr>
+        <w:tabs>
+          <w:tab w:val="num" w:pos="3600"/>
+        </w:tabs>
+        <w:ind w:left="3600" w:hanging="360"/>
+      </w:pPr>
+      <w:rPr>
+        <w:rFonts w:ascii="Wingdings" w:hAnsi="Wingdings" w:hint="default"/>
+        <w:sz w:val="20"/>
+      </w:rPr>
+    </w:lvl>
+    <w:lvl w:ilvl="5" w:tentative="1">
+      <w:start w:val="1"/>
+      <w:numFmt w:val="bullet"/>
+      <w:lvlText w:val=""/>
+      <w:lvlJc w:val="left"/>
+      <w:pPr>
+        <w:tabs>
+          <w:tab w:val="num" w:pos="4320"/>
+        </w:tabs>
+        <w:ind w:left="4320" w:hanging="360"/>
+      </w:pPr>
+      <w:rPr>
+        <w:rFonts w:ascii="Wingdings" w:hAnsi="Wingdings" w:hint="default"/>
+        <w:sz w:val="20"/>
+      </w:rPr>
+    </w:lvl>
+    <w:lvl w:ilvl="6" w:tentative="1">
+      <w:start w:val="1"/>
+      <w:numFmt w:val="bullet"/>
+      <w:lvlText w:val=""/>
+      <w:lvlJc w:val="left"/>
+      <w:pPr>
+        <w:tabs>
+          <w:tab w:val="num" w:pos="5040"/>
+        </w:tabs>
+        <w:ind w:left="5040" w:hanging="360"/>
+      </w:pPr>
+      <w:rPr>
+        <w:rFonts w:ascii="Wingdings" w:hAnsi="Wingdings" w:hint="default"/>
+        <w:sz w:val="20"/>
+      </w:rPr>
+    </w:lvl>
+    <w:lvl w:ilvl="7" w:tentative="1">
+      <w:start w:val="1"/>
+      <w:numFmt w:val="bullet"/>
+      <w:lvlText w:val=""/>
+      <w:lvlJc w:val="left"/>
+      <w:pPr>
+        <w:tabs>
+          <w:tab w:val="num" w:pos="5760"/>
+        </w:tabs>
+        <w:ind w:left="5760" w:hanging="360"/>
+      </w:pPr>
+      <w:rPr>
+        <w:rFonts w:ascii="Wingdings" w:hAnsi="Wingdings" w:hint="default"/>
+        <w:sz w:val="20"/>
+      </w:rPr>
+    </w:lvl>
+    <w:lvl w:ilvl="8" w:tentative="1">
+      <w:start w:val="1"/>
+      <w:numFmt w:val="bullet"/>
+      <w:lvlText w:val=""/>
+      <w:lvlJc w:val="left"/>
+      <w:pPr>
+        <w:tabs>
+          <w:tab w:val="num" w:pos="6480"/>
+        </w:tabs>
+        <w:ind w:left="6480" w:hanging="360"/>
+      </w:pPr>
+      <w:rPr>
+        <w:rFonts w:ascii="Wingdings" w:hAnsi="Wingdings" w:hint="default"/>
+        <w:sz w:val="20"/>
+      </w:rPr>
+    </w:lvl>
+  </w:abstractNum>
+  <w:abstractNum w:abstractNumId="12" w15:restartNumberingAfterBreak="0">
+    <w:nsid w:val="72E32C84"/>
+    <w:multiLevelType w:val="multilevel"/>
+    <w:tmpl w:val="0574832A"/>
+    <w:lvl w:ilvl="0">
+      <w:start w:val="1"/>
+      <w:numFmt w:val="bullet"/>
+      <w:lvlText w:val=""/>
+      <w:lvlJc w:val="left"/>
+      <w:pPr>
+        <w:tabs>
+          <w:tab w:val="num" w:pos="720"/>
+        </w:tabs>
+        <w:ind w:left="720" w:hanging="360"/>
+      </w:pPr>
+      <w:rPr>
+        <w:rFonts w:ascii="Symbol" w:hAnsi="Symbol" w:hint="default"/>
+        <w:sz w:val="20"/>
+      </w:rPr>
+    </w:lvl>
+    <w:lvl w:ilvl="1" w:tentative="1">
+      <w:start w:val="1"/>
+      <w:numFmt w:val="bullet"/>
+      <w:lvlText w:val="o"/>
+      <w:lvlJc w:val="left"/>
+      <w:pPr>
+        <w:tabs>
+          <w:tab w:val="num" w:pos="1440"/>
+        </w:tabs>
+        <w:ind w:left="1440" w:hanging="360"/>
+      </w:pPr>
+      <w:rPr>
+        <w:rFonts w:ascii="Courier New" w:hAnsi="Courier New" w:hint="default"/>
+        <w:sz w:val="20"/>
+      </w:rPr>
+    </w:lvl>
+    <w:lvl w:ilvl="2" w:tentative="1">
+      <w:start w:val="1"/>
+      <w:numFmt w:val="bullet"/>
+      <w:lvlText w:val=""/>
+      <w:lvlJc w:val="left"/>
+      <w:pPr>
+        <w:tabs>
+          <w:tab w:val="num" w:pos="2160"/>
+        </w:tabs>
+        <w:ind w:left="2160" w:hanging="360"/>
+      </w:pPr>
+      <w:rPr>
+        <w:rFonts w:ascii="Wingdings" w:hAnsi="Wingdings" w:hint="default"/>
+        <w:sz w:val="20"/>
+      </w:rPr>
+    </w:lvl>
+    <w:lvl w:ilvl="3" w:tentative="1">
+      <w:start w:val="1"/>
+      <w:numFmt w:val="bullet"/>
+      <w:lvlText w:val=""/>
+      <w:lvlJc w:val="left"/>
+      <w:pPr>
+        <w:tabs>
+          <w:tab w:val="num" w:pos="2880"/>
+        </w:tabs>
+        <w:ind w:left="2880" w:hanging="360"/>
+      </w:pPr>
+      <w:rPr>
+        <w:rFonts w:ascii="Wingdings" w:hAnsi="Wingdings" w:hint="default"/>
+        <w:sz w:val="20"/>
+      </w:rPr>
+    </w:lvl>
+    <w:lvl w:ilvl="4" w:tentative="1">
+      <w:start w:val="1"/>
+      <w:numFmt w:val="bullet"/>
+      <w:lvlText w:val=""/>
+      <w:lvlJc w:val="left"/>
+      <w:pPr>
+        <w:tabs>
+          <w:tab w:val="num" w:pos="3600"/>
+        </w:tabs>
+        <w:ind w:left="3600" w:hanging="360"/>
+      </w:pPr>
+      <w:rPr>
+        <w:rFonts w:ascii="Wingdings" w:hAnsi="Wingdings" w:hint="default"/>
+        <w:sz w:val="20"/>
+      </w:rPr>
+    </w:lvl>
+    <w:lvl w:ilvl="5" w:tentative="1">
+      <w:start w:val="1"/>
+      <w:numFmt w:val="bullet"/>
+      <w:lvlText w:val=""/>
+      <w:lvlJc w:val="left"/>
+      <w:pPr>
+        <w:tabs>
+          <w:tab w:val="num" w:pos="4320"/>
+        </w:tabs>
+        <w:ind w:left="4320" w:hanging="360"/>
+      </w:pPr>
+      <w:rPr>
+        <w:rFonts w:ascii="Wingdings" w:hAnsi="Wingdings" w:hint="default"/>
+        <w:sz w:val="20"/>
+      </w:rPr>
+    </w:lvl>
+    <w:lvl w:ilvl="6" w:tentative="1">
+      <w:start w:val="1"/>
+      <w:numFmt w:val="bullet"/>
+      <w:lvlText w:val=""/>
+      <w:lvlJc w:val="left"/>
+      <w:pPr>
+        <w:tabs>
+          <w:tab w:val="num" w:pos="5040"/>
+        </w:tabs>
+        <w:ind w:left="5040" w:hanging="360"/>
+      </w:pPr>
+      <w:rPr>
+        <w:rFonts w:ascii="Wingdings" w:hAnsi="Wingdings" w:hint="default"/>
+        <w:sz w:val="20"/>
+      </w:rPr>
+    </w:lvl>
+    <w:lvl w:ilvl="7" w:tentative="1">
+      <w:start w:val="1"/>
+      <w:numFmt w:val="bullet"/>
+      <w:lvlText w:val=""/>
+      <w:lvlJc w:val="left"/>
+      <w:pPr>
+        <w:tabs>
+          <w:tab w:val="num" w:pos="5760"/>
+        </w:tabs>
+        <w:ind w:left="5760" w:hanging="360"/>
+      </w:pPr>
+      <w:rPr>
+        <w:rFonts w:ascii="Wingdings" w:hAnsi="Wingdings" w:hint="default"/>
+        <w:sz w:val="20"/>
+      </w:rPr>
+    </w:lvl>
+    <w:lvl w:ilvl="8" w:tentative="1">
+      <w:start w:val="1"/>
+      <w:numFmt w:val="bullet"/>
+      <w:lvlText w:val=""/>
+      <w:lvlJc w:val="left"/>
+      <w:pPr>
+        <w:tabs>
+          <w:tab w:val="num" w:pos="6480"/>
+        </w:tabs>
+        <w:ind w:left="6480" w:hanging="360"/>
+      </w:pPr>
+      <w:rPr>
+        <w:rFonts w:ascii="Wingdings" w:hAnsi="Wingdings" w:hint="default"/>
+        <w:sz w:val="20"/>
+      </w:rPr>
+    </w:lvl>
+  </w:abstractNum>
+  <w:abstractNum w:abstractNumId="13" w15:restartNumberingAfterBreak="0">
+    <w:nsid w:val="72F9796F"/>
+    <w:multiLevelType w:val="multilevel"/>
+    <w:tmpl w:val="E6CC9FC2"/>
+    <w:lvl w:ilvl="0">
+      <w:start w:val="1"/>
+      <w:numFmt w:val="bullet"/>
+      <w:lvlText w:val=""/>
+      <w:lvlJc w:val="left"/>
+      <w:pPr>
+        <w:tabs>
+          <w:tab w:val="num" w:pos="720"/>
+        </w:tabs>
+        <w:ind w:left="720" w:hanging="360"/>
+      </w:pPr>
+      <w:rPr>
+        <w:rFonts w:ascii="Symbol" w:hAnsi="Symbol" w:hint="default"/>
+        <w:sz w:val="20"/>
+      </w:rPr>
+    </w:lvl>
+    <w:lvl w:ilvl="1" w:tentative="1">
+      <w:start w:val="1"/>
+      <w:numFmt w:val="bullet"/>
+      <w:lvlText w:val="o"/>
+      <w:lvlJc w:val="left"/>
+      <w:pPr>
+        <w:tabs>
+          <w:tab w:val="num" w:pos="1440"/>
+        </w:tabs>
+        <w:ind w:left="1440" w:hanging="360"/>
+      </w:pPr>
+      <w:rPr>
+        <w:rFonts w:ascii="Courier New" w:hAnsi="Courier New" w:hint="default"/>
+        <w:sz w:val="20"/>
+      </w:rPr>
+    </w:lvl>
+    <w:lvl w:ilvl="2" w:tentative="1">
+      <w:start w:val="1"/>
+      <w:numFmt w:val="bullet"/>
+      <w:lvlText w:val=""/>
+      <w:lvlJc w:val="left"/>
+      <w:pPr>
+        <w:tabs>
+          <w:tab w:val="num" w:pos="2160"/>
+        </w:tabs>
+        <w:ind w:left="2160" w:hanging="360"/>
+      </w:pPr>
+      <w:rPr>
+        <w:rFonts w:ascii="Wingdings" w:hAnsi="Wingdings" w:hint="default"/>
+        <w:sz w:val="20"/>
+      </w:rPr>
+    </w:lvl>
+    <w:lvl w:ilvl="3" w:tentative="1">
+      <w:start w:val="1"/>
+      <w:numFmt w:val="bullet"/>
+      <w:lvlText w:val=""/>
+      <w:lvlJc w:val="left"/>
+      <w:pPr>
+        <w:tabs>
+          <w:tab w:val="num" w:pos="2880"/>
+        </w:tabs>
+        <w:ind w:left="2880" w:hanging="360"/>
+      </w:pPr>
+      <w:rPr>
+        <w:rFonts w:ascii="Wingdings" w:hAnsi="Wingdings" w:hint="default"/>
+        <w:sz w:val="20"/>
+      </w:rPr>
+    </w:lvl>
+    <w:lvl w:ilvl="4" w:tentative="1">
+      <w:start w:val="1"/>
+      <w:numFmt w:val="bullet"/>
+      <w:lvlText w:val=""/>
+      <w:lvlJc w:val="left"/>
+      <w:pPr>
+        <w:tabs>
+          <w:tab w:val="num" w:pos="3600"/>
+        </w:tabs>
+        <w:ind w:left="3600" w:hanging="360"/>
+      </w:pPr>
+      <w:rPr>
+        <w:rFonts w:ascii="Wingdings" w:hAnsi="Wingdings" w:hint="default"/>
+        <w:sz w:val="20"/>
+      </w:rPr>
+    </w:lvl>
+    <w:lvl w:ilvl="5" w:tentative="1">
+      <w:start w:val="1"/>
+      <w:numFmt w:val="bullet"/>
+      <w:lvlText w:val=""/>
+      <w:lvlJc w:val="left"/>
+      <w:pPr>
+        <w:tabs>
+          <w:tab w:val="num" w:pos="4320"/>
+        </w:tabs>
+        <w:ind w:left="4320" w:hanging="360"/>
+      </w:pPr>
+      <w:rPr>
+        <w:rFonts w:ascii="Wingdings" w:hAnsi="Wingdings" w:hint="default"/>
+        <w:sz w:val="20"/>
+      </w:rPr>
+    </w:lvl>
+    <w:lvl w:ilvl="6" w:tentative="1">
+      <w:start w:val="1"/>
+      <w:numFmt w:val="bullet"/>
+      <w:lvlText w:val=""/>
+      <w:lvlJc w:val="left"/>
+      <w:pPr>
+        <w:tabs>
+          <w:tab w:val="num" w:pos="5040"/>
+        </w:tabs>
+        <w:ind w:left="5040" w:hanging="360"/>
+      </w:pPr>
+      <w:rPr>
+        <w:rFonts w:ascii="Wingdings" w:hAnsi="Wingdings" w:hint="default"/>
+        <w:sz w:val="20"/>
+      </w:rPr>
+    </w:lvl>
+    <w:lvl w:ilvl="7" w:tentative="1">
+      <w:start w:val="1"/>
+      <w:numFmt w:val="bullet"/>
+      <w:lvlText w:val=""/>
+      <w:lvlJc w:val="left"/>
+      <w:pPr>
+        <w:tabs>
+          <w:tab w:val="num" w:pos="5760"/>
+        </w:tabs>
+        <w:ind w:left="5760" w:hanging="360"/>
+      </w:pPr>
+      <w:rPr>
+        <w:rFonts w:ascii="Wingdings" w:hAnsi="Wingdings" w:hint="default"/>
+        <w:sz w:val="20"/>
+      </w:rPr>
+    </w:lvl>
+    <w:lvl w:ilvl="8" w:tentative="1">
+      <w:start w:val="1"/>
+      <w:numFmt w:val="bullet"/>
+      <w:lvlText w:val=""/>
+      <w:lvlJc w:val="left"/>
+      <w:pPr>
+        <w:tabs>
+          <w:tab w:val="num" w:pos="6480"/>
+        </w:tabs>
+        <w:ind w:left="6480" w:hanging="360"/>
+      </w:pPr>
+      <w:rPr>
+        <w:rFonts w:ascii="Wingdings" w:hAnsi="Wingdings" w:hint="default"/>
+        <w:sz w:val="20"/>
+      </w:rPr>
+    </w:lvl>
+  </w:abstractNum>
+  <w:abstractNum w:abstractNumId="14" w15:restartNumberingAfterBreak="0">
+    <w:nsid w:val="72F97B87"/>
+    <w:multiLevelType w:val="multilevel"/>
+    <w:tmpl w:val="8FE6F66C"/>
+    <w:lvl w:ilvl="0">
+      <w:start w:val="1"/>
+      <w:numFmt w:val="bullet"/>
+      <w:lvlText w:val=""/>
+      <w:lvlJc w:val="left"/>
+      <w:pPr>
+        <w:tabs>
+          <w:tab w:val="num" w:pos="720"/>
+        </w:tabs>
+        <w:ind w:left="720" w:hanging="360"/>
+      </w:pPr>
+      <w:rPr>
+        <w:rFonts w:ascii="Symbol" w:hAnsi="Symbol" w:hint="default"/>
+        <w:sz w:val="20"/>
+      </w:rPr>
+    </w:lvl>
+    <w:lvl w:ilvl="1" w:tentative="1">
+      <w:start w:val="1"/>
+      <w:numFmt w:val="bullet"/>
+      <w:lvlText w:val="o"/>
+      <w:lvlJc w:val="left"/>
+      <w:pPr>
+        <w:tabs>
+          <w:tab w:val="num" w:pos="1440"/>
+        </w:tabs>
+        <w:ind w:left="1440" w:hanging="360"/>
+      </w:pPr>
+      <w:rPr>
+        <w:rFonts w:ascii="Courier New" w:hAnsi="Courier New" w:hint="default"/>
+        <w:sz w:val="20"/>
+      </w:rPr>
+    </w:lvl>
+    <w:lvl w:ilvl="2" w:tentative="1">
+      <w:start w:val="1"/>
+      <w:numFmt w:val="bullet"/>
+      <w:lvlText w:val=""/>
+      <w:lvlJc w:val="left"/>
+      <w:pPr>
+        <w:tabs>
+          <w:tab w:val="num" w:pos="2160"/>
+        </w:tabs>
+        <w:ind w:left="2160" w:hanging="360"/>
+      </w:pPr>
+      <w:rPr>
+        <w:rFonts w:ascii="Wingdings" w:hAnsi="Wingdings" w:hint="default"/>
+        <w:sz w:val="20"/>
+      </w:rPr>
+    </w:lvl>
+    <w:lvl w:ilvl="3" w:tentative="1">
+      <w:start w:val="1"/>
+      <w:numFmt w:val="bullet"/>
+      <w:lvlText w:val=""/>
+      <w:lvlJc w:val="left"/>
+      <w:pPr>
+        <w:tabs>
+          <w:tab w:val="num" w:pos="2880"/>
+        </w:tabs>
+        <w:ind w:left="2880" w:hanging="360"/>
+      </w:pPr>
+      <w:rPr>
+        <w:rFonts w:ascii="Wingdings" w:hAnsi="Wingdings" w:hint="default"/>
+        <w:sz w:val="20"/>
+      </w:rPr>
+    </w:lvl>
+    <w:lvl w:ilvl="4" w:tentative="1">
+      <w:start w:val="1"/>
+      <w:numFmt w:val="bullet"/>
+      <w:lvlText w:val=""/>
+      <w:lvlJc w:val="left"/>
+      <w:pPr>
+        <w:tabs>
+          <w:tab w:val="num" w:pos="3600"/>
+        </w:tabs>
+        <w:ind w:left="3600" w:hanging="360"/>
+      </w:pPr>
+      <w:rPr>
+        <w:rFonts w:ascii="Wingdings" w:hAnsi="Wingdings" w:hint="default"/>
+        <w:sz w:val="20"/>
+      </w:rPr>
+    </w:lvl>
+    <w:lvl w:ilvl="5" w:tentative="1">
+      <w:start w:val="1"/>
+      <w:numFmt w:val="bullet"/>
+      <w:lvlText w:val=""/>
+      <w:lvlJc w:val="left"/>
+      <w:pPr>
+        <w:tabs>
+          <w:tab w:val="num" w:pos="4320"/>
+        </w:tabs>
+        <w:ind w:left="4320" w:hanging="360"/>
+      </w:pPr>
+      <w:rPr>
+        <w:rFonts w:ascii="Wingdings" w:hAnsi="Wingdings" w:hint="default"/>
+        <w:sz w:val="20"/>
+      </w:rPr>
+    </w:lvl>
+    <w:lvl w:ilvl="6" w:tentative="1">
+      <w:start w:val="1"/>
+      <w:numFmt w:val="bullet"/>
+      <w:lvlText w:val=""/>
+      <w:lvlJc w:val="left"/>
+      <w:pPr>
+        <w:tabs>
+          <w:tab w:val="num" w:pos="5040"/>
+        </w:tabs>
+        <w:ind w:left="5040" w:hanging="360"/>
+      </w:pPr>
+      <w:rPr>
+        <w:rFonts w:ascii="Wingdings" w:hAnsi="Wingdings" w:hint="default"/>
+        <w:sz w:val="20"/>
+      </w:rPr>
+    </w:lvl>
+    <w:lvl w:ilvl="7" w:tentative="1">
+      <w:start w:val="1"/>
+      <w:numFmt w:val="bullet"/>
+      <w:lvlText w:val=""/>
+      <w:lvlJc w:val="left"/>
+      <w:pPr>
+        <w:tabs>
+          <w:tab w:val="num" w:pos="5760"/>
+        </w:tabs>
+        <w:ind w:left="5760" w:hanging="360"/>
+      </w:pPr>
+      <w:rPr>
+        <w:rFonts w:ascii="Wingdings" w:hAnsi="Wingdings" w:hint="default"/>
+        <w:sz w:val="20"/>
+      </w:rPr>
+    </w:lvl>
+    <w:lvl w:ilvl="8" w:tentative="1">
+      <w:start w:val="1"/>
+      <w:numFmt w:val="bullet"/>
+      <w:lvlText w:val=""/>
+      <w:lvlJc w:val="left"/>
+      <w:pPr>
+        <w:tabs>
+          <w:tab w:val="num" w:pos="6480"/>
+        </w:tabs>
+        <w:ind w:left="6480" w:hanging="360"/>
+      </w:pPr>
+      <w:rPr>
+        <w:rFonts w:ascii="Wingdings" w:hAnsi="Wingdings" w:hint="default"/>
+        <w:sz w:val="20"/>
+      </w:rPr>
+    </w:lvl>
+  </w:abstractNum>
+  <w:abstractNum w:abstractNumId="15" w15:restartNumberingAfterBreak="0">
+    <w:nsid w:val="744C46B8"/>
+    <w:multiLevelType w:val="multilevel"/>
+    <w:tmpl w:val="93C2232A"/>
+    <w:lvl w:ilvl="0">
+      <w:start w:val="1"/>
+      <w:numFmt w:val="bullet"/>
+      <w:lvlText w:val=""/>
+      <w:lvlJc w:val="left"/>
+      <w:pPr>
+        <w:tabs>
+          <w:tab w:val="num" w:pos="720"/>
+        </w:tabs>
+        <w:ind w:left="720" w:hanging="360"/>
+      </w:pPr>
+      <w:rPr>
+        <w:rFonts w:ascii="Symbol" w:hAnsi="Symbol" w:hint="default"/>
+        <w:sz w:val="20"/>
+      </w:rPr>
+    </w:lvl>
+    <w:lvl w:ilvl="1" w:tentative="1">
+      <w:start w:val="1"/>
+      <w:numFmt w:val="bullet"/>
+      <w:lvlText w:val="o"/>
+      <w:lvlJc w:val="left"/>
+      <w:pPr>
+        <w:tabs>
+          <w:tab w:val="num" w:pos="1440"/>
+        </w:tabs>
+        <w:ind w:left="1440" w:hanging="360"/>
+      </w:pPr>
+      <w:rPr>
+        <w:rFonts w:ascii="Courier New" w:hAnsi="Courier New" w:hint="default"/>
+        <w:sz w:val="20"/>
+      </w:rPr>
+    </w:lvl>
+    <w:lvl w:ilvl="2" w:tentative="1">
+      <w:start w:val="1"/>
+      <w:numFmt w:val="bullet"/>
+      <w:lvlText w:val=""/>
+      <w:lvlJc w:val="left"/>
+      <w:pPr>
+        <w:tabs>
+          <w:tab w:val="num" w:pos="2160"/>
+        </w:tabs>
+        <w:ind w:left="2160" w:hanging="360"/>
+      </w:pPr>
+      <w:rPr>
+        <w:rFonts w:ascii="Wingdings" w:hAnsi="Wingdings" w:hint="default"/>
+        <w:sz w:val="20"/>
+      </w:rPr>
+    </w:lvl>
+    <w:lvl w:ilvl="3" w:tentative="1">
+      <w:start w:val="1"/>
+      <w:numFmt w:val="bullet"/>
+      <w:lvlText w:val=""/>
+      <w:lvlJc w:val="left"/>
+      <w:pPr>
+        <w:tabs>
+          <w:tab w:val="num" w:pos="2880"/>
+        </w:tabs>
+        <w:ind w:left="2880" w:hanging="360"/>
+      </w:pPr>
+      <w:rPr>
+        <w:rFonts w:ascii="Wingdings" w:hAnsi="Wingdings" w:hint="default"/>
+        <w:sz w:val="20"/>
+      </w:rPr>
+    </w:lvl>
+    <w:lvl w:ilvl="4" w:tentative="1">
+      <w:start w:val="1"/>
+      <w:numFmt w:val="bullet"/>
+      <w:lvlText w:val=""/>
+      <w:lvlJc w:val="left"/>
+      <w:pPr>
+        <w:tabs>
+          <w:tab w:val="num" w:pos="3600"/>
+        </w:tabs>
+        <w:ind w:left="3600" w:hanging="360"/>
+      </w:pPr>
+      <w:rPr>
+        <w:rFonts w:ascii="Wingdings" w:hAnsi="Wingdings" w:hint="default"/>
+        <w:sz w:val="20"/>
+      </w:rPr>
+    </w:lvl>
+    <w:lvl w:ilvl="5" w:tentative="1">
+      <w:start w:val="1"/>
+      <w:numFmt w:val="bullet"/>
+      <w:lvlText w:val=""/>
+      <w:lvlJc w:val="left"/>
+      <w:pPr>
+        <w:tabs>
+          <w:tab w:val="num" w:pos="4320"/>
+        </w:tabs>
+        <w:ind w:left="4320" w:hanging="360"/>
+      </w:pPr>
+      <w:rPr>
+        <w:rFonts w:ascii="Wingdings" w:hAnsi="Wingdings" w:hint="default"/>
+        <w:sz w:val="20"/>
+      </w:rPr>
+    </w:lvl>
+    <w:lvl w:ilvl="6" w:tentative="1">
+      <w:start w:val="1"/>
+      <w:numFmt w:val="bullet"/>
+      <w:lvlText w:val=""/>
+      <w:lvlJc w:val="left"/>
+      <w:pPr>
+        <w:tabs>
+          <w:tab w:val="num" w:pos="5040"/>
+        </w:tabs>
+        <w:ind w:left="5040" w:hanging="360"/>
+      </w:pPr>
+      <w:rPr>
+        <w:rFonts w:ascii="Wingdings" w:hAnsi="Wingdings" w:hint="default"/>
+        <w:sz w:val="20"/>
+      </w:rPr>
+    </w:lvl>
+    <w:lvl w:ilvl="7" w:tentative="1">
+      <w:start w:val="1"/>
+      <w:numFmt w:val="bullet"/>
+      <w:lvlText w:val=""/>
+      <w:lvlJc w:val="left"/>
+      <w:pPr>
+        <w:tabs>
+          <w:tab w:val="num" w:pos="5760"/>
+        </w:tabs>
+        <w:ind w:left="5760" w:hanging="360"/>
+      </w:pPr>
+      <w:rPr>
+        <w:rFonts w:ascii="Wingdings" w:hAnsi="Wingdings" w:hint="default"/>
+        <w:sz w:val="20"/>
+      </w:rPr>
+    </w:lvl>
+    <w:lvl w:ilvl="8" w:tentative="1">
+      <w:start w:val="1"/>
+      <w:numFmt w:val="bullet"/>
+      <w:lvlText w:val=""/>
+      <w:lvlJc w:val="left"/>
+      <w:pPr>
+        <w:tabs>
+          <w:tab w:val="num" w:pos="6480"/>
+        </w:tabs>
+        <w:ind w:left="6480" w:hanging="360"/>
+      </w:pPr>
+      <w:rPr>
+        <w:rFonts w:ascii="Wingdings" w:hAnsi="Wingdings" w:hint="default"/>
+        <w:sz w:val="20"/>
+      </w:rPr>
+    </w:lvl>
+  </w:abstractNum>
+  <w:abstractNum w:abstractNumId="16" w15:restartNumberingAfterBreak="0">
+    <w:nsid w:val="753E2FAC"/>
+    <w:multiLevelType w:val="multilevel"/>
+    <w:tmpl w:val="1E343CB8"/>
+    <w:lvl w:ilvl="0">
+      <w:start w:val="1"/>
+      <w:numFmt w:val="bullet"/>
+      <w:lvlText w:val=""/>
+      <w:lvlJc w:val="left"/>
+      <w:pPr>
+        <w:tabs>
+          <w:tab w:val="num" w:pos="720"/>
+        </w:tabs>
+        <w:ind w:left="720" w:hanging="360"/>
+      </w:pPr>
+      <w:rPr>
+        <w:rFonts w:ascii="Symbol" w:hAnsi="Symbol" w:hint="default"/>
+        <w:sz w:val="20"/>
+      </w:rPr>
+    </w:lvl>
+    <w:lvl w:ilvl="1" w:tentative="1">
+      <w:start w:val="1"/>
+      <w:numFmt w:val="bullet"/>
+      <w:lvlText w:val="o"/>
+      <w:lvlJc w:val="left"/>
+      <w:pPr>
+        <w:tabs>
+          <w:tab w:val="num" w:pos="1440"/>
+        </w:tabs>
+        <w:ind w:left="1440" w:hanging="360"/>
+      </w:pPr>
+      <w:rPr>
+        <w:rFonts w:ascii="Courier New" w:hAnsi="Courier New" w:hint="default"/>
+        <w:sz w:val="20"/>
+      </w:rPr>
+    </w:lvl>
+    <w:lvl w:ilvl="2" w:tentative="1">
+      <w:start w:val="1"/>
+      <w:numFmt w:val="bullet"/>
+      <w:lvlText w:val=""/>
+      <w:lvlJc w:val="left"/>
+      <w:pPr>
+        <w:tabs>
+          <w:tab w:val="num" w:pos="2160"/>
+        </w:tabs>
+        <w:ind w:left="2160" w:hanging="360"/>
+      </w:pPr>
+      <w:rPr>
+        <w:rFonts w:ascii="Wingdings" w:hAnsi="Wingdings" w:hint="default"/>
+        <w:sz w:val="20"/>
+      </w:rPr>
+    </w:lvl>
+    <w:lvl w:ilvl="3" w:tentative="1">
+      <w:start w:val="1"/>
+      <w:numFmt w:val="bullet"/>
+      <w:lvlText w:val=""/>
+      <w:lvlJc w:val="left"/>
+      <w:pPr>
+        <w:tabs>
+          <w:tab w:val="num" w:pos="2880"/>
+        </w:tabs>
+        <w:ind w:left="2880" w:hanging="360"/>
+      </w:pPr>
+      <w:rPr>
+        <w:rFonts w:ascii="Wingdings" w:hAnsi="Wingdings" w:hint="default"/>
+        <w:sz w:val="20"/>
+      </w:rPr>
+    </w:lvl>
+    <w:lvl w:ilvl="4" w:tentative="1">
+      <w:start w:val="1"/>
+      <w:numFmt w:val="bullet"/>
+      <w:lvlText w:val=""/>
+      <w:lvlJc w:val="left"/>
+      <w:pPr>
+        <w:tabs>
+          <w:tab w:val="num" w:pos="3600"/>
+        </w:tabs>
+        <w:ind w:left="3600" w:hanging="360"/>
+      </w:pPr>
+      <w:rPr>
+        <w:rFonts w:ascii="Wingdings" w:hAnsi="Wingdings" w:hint="default"/>
+        <w:sz w:val="20"/>
+      </w:rPr>
+    </w:lvl>
+    <w:lvl w:ilvl="5" w:tentative="1">
+      <w:start w:val="1"/>
+      <w:numFmt w:val="bullet"/>
+      <w:lvlText w:val=""/>
+      <w:lvlJc w:val="left"/>
+      <w:pPr>
+        <w:tabs>
+          <w:tab w:val="num" w:pos="4320"/>
+        </w:tabs>
+        <w:ind w:left="4320" w:hanging="360"/>
+      </w:pPr>
+      <w:rPr>
+        <w:rFonts w:ascii="Wingdings" w:hAnsi="Wingdings" w:hint="default"/>
+        <w:sz w:val="20"/>
+      </w:rPr>
+    </w:lvl>
+    <w:lvl w:ilvl="6" w:tentative="1">
+      <w:start w:val="1"/>
+      <w:numFmt w:val="bullet"/>
+      <w:lvlText w:val=""/>
+      <w:lvlJc w:val="left"/>
+      <w:pPr>
+        <w:tabs>
+          <w:tab w:val="num" w:pos="5040"/>
+        </w:tabs>
+        <w:ind w:left="5040" w:hanging="360"/>
+      </w:pPr>
+      <w:rPr>
+        <w:rFonts w:ascii="Wingdings" w:hAnsi="Wingdings" w:hint="default"/>
+        <w:sz w:val="20"/>
+      </w:rPr>
+    </w:lvl>
+    <w:lvl w:ilvl="7" w:tentative="1">
+      <w:start w:val="1"/>
+      <w:numFmt w:val="bullet"/>
+      <w:lvlText w:val=""/>
+      <w:lvlJc w:val="left"/>
+      <w:pPr>
+        <w:tabs>
+          <w:tab w:val="num" w:pos="5760"/>
+        </w:tabs>
+        <w:ind w:left="5760" w:hanging="360"/>
+      </w:pPr>
+      <w:rPr>
+        <w:rFonts w:ascii="Wingdings" w:hAnsi="Wingdings" w:hint="default"/>
+        <w:sz w:val="20"/>
+      </w:rPr>
+    </w:lvl>
+    <w:lvl w:ilvl="8" w:tentative="1">
+      <w:start w:val="1"/>
+      <w:numFmt w:val="bullet"/>
+      <w:lvlText w:val=""/>
+      <w:lvlJc w:val="left"/>
+      <w:pPr>
+        <w:tabs>
+          <w:tab w:val="num" w:pos="6480"/>
+        </w:tabs>
+        <w:ind w:left="6480" w:hanging="360"/>
+      </w:pPr>
+      <w:rPr>
+        <w:rFonts w:ascii="Wingdings" w:hAnsi="Wingdings" w:hint="default"/>
+        <w:sz w:val="20"/>
+      </w:rPr>
+    </w:lvl>
+  </w:abstractNum>
+  <w:abstractNum w:abstractNumId="17" w15:restartNumberingAfterBreak="0">
+    <w:nsid w:val="76794BF0"/>
+    <w:multiLevelType w:val="multilevel"/>
+    <w:tmpl w:val="D3E44F98"/>
+    <w:lvl w:ilvl="0">
+      <w:start w:val="1"/>
+      <w:numFmt w:val="bullet"/>
+      <w:lvlText w:val=""/>
+      <w:lvlJc w:val="left"/>
+      <w:pPr>
+        <w:tabs>
+          <w:tab w:val="num" w:pos="720"/>
+        </w:tabs>
+        <w:ind w:left="720" w:hanging="360"/>
+      </w:pPr>
+      <w:rPr>
+        <w:rFonts w:ascii="Symbol" w:hAnsi="Symbol" w:hint="default"/>
+        <w:sz w:val="20"/>
+      </w:rPr>
+    </w:lvl>
+    <w:lvl w:ilvl="1" w:tentative="1">
+      <w:start w:val="1"/>
+      <w:numFmt w:val="bullet"/>
+      <w:lvlText w:val="o"/>
+      <w:lvlJc w:val="left"/>
+      <w:pPr>
+        <w:tabs>
+          <w:tab w:val="num" w:pos="1440"/>
+        </w:tabs>
+        <w:ind w:left="1440" w:hanging="360"/>
+      </w:pPr>
+      <w:rPr>
+        <w:rFonts w:ascii="Courier New" w:hAnsi="Courier New" w:hint="default"/>
+        <w:sz w:val="20"/>
+      </w:rPr>
+    </w:lvl>
+    <w:lvl w:ilvl="2" w:tentative="1">
+      <w:start w:val="1"/>
+      <w:numFmt w:val="bullet"/>
+      <w:lvlText w:val=""/>
+      <w:lvlJc w:val="left"/>
+      <w:pPr>
+        <w:tabs>
+          <w:tab w:val="num" w:pos="2160"/>
+        </w:tabs>
+        <w:ind w:left="2160" w:hanging="360"/>
+      </w:pPr>
+      <w:rPr>
+        <w:rFonts w:ascii="Wingdings" w:hAnsi="Wingdings" w:hint="default"/>
+        <w:sz w:val="20"/>
+      </w:rPr>
+    </w:lvl>
+    <w:lvl w:ilvl="3" w:tentative="1">
+      <w:start w:val="1"/>
+      <w:numFmt w:val="bullet"/>
+      <w:lvlText w:val=""/>
+      <w:lvlJc w:val="left"/>
+      <w:pPr>
+        <w:tabs>
+          <w:tab w:val="num" w:pos="2880"/>
+        </w:tabs>
+        <w:ind w:left="2880" w:hanging="360"/>
+      </w:pPr>
+      <w:rPr>
+        <w:rFonts w:ascii="Wingdings" w:hAnsi="Wingdings" w:hint="default"/>
+        <w:sz w:val="20"/>
+      </w:rPr>
+    </w:lvl>
+    <w:lvl w:ilvl="4" w:tentative="1">
+      <w:start w:val="1"/>
+      <w:numFmt w:val="bullet"/>
+      <w:lvlText w:val=""/>
+      <w:lvlJc w:val="left"/>
+      <w:pPr>
+        <w:tabs>
+          <w:tab w:val="num" w:pos="3600"/>
+        </w:tabs>
+        <w:ind w:left="3600" w:hanging="360"/>
+      </w:pPr>
+      <w:rPr>
+        <w:rFonts w:ascii="Wingdings" w:hAnsi="Wingdings" w:hint="default"/>
+        <w:sz w:val="20"/>
+      </w:rPr>
+    </w:lvl>
+    <w:lvl w:ilvl="5" w:tentative="1">
+      <w:start w:val="1"/>
+      <w:numFmt w:val="bullet"/>
+      <w:lvlText w:val=""/>
+      <w:lvlJc w:val="left"/>
+      <w:pPr>
+        <w:tabs>
+          <w:tab w:val="num" w:pos="4320"/>
+        </w:tabs>
+        <w:ind w:left="4320" w:hanging="360"/>
+      </w:pPr>
+      <w:rPr>
+        <w:rFonts w:ascii="Wingdings" w:hAnsi="Wingdings" w:hint="default"/>
+        <w:sz w:val="20"/>
+      </w:rPr>
+    </w:lvl>
+    <w:lvl w:ilvl="6" w:tentative="1">
+      <w:start w:val="1"/>
+      <w:numFmt w:val="bullet"/>
+      <w:lvlText w:val=""/>
+      <w:lvlJc w:val="left"/>
+      <w:pPr>
+        <w:tabs>
+          <w:tab w:val="num" w:pos="5040"/>
+        </w:tabs>
+        <w:ind w:left="5040" w:hanging="360"/>
+      </w:pPr>
+      <w:rPr>
+        <w:rFonts w:ascii="Wingdings" w:hAnsi="Wingdings" w:hint="default"/>
+        <w:sz w:val="20"/>
+      </w:rPr>
+    </w:lvl>
+    <w:lvl w:ilvl="7" w:tentative="1">
+      <w:start w:val="1"/>
+      <w:numFmt w:val="bullet"/>
+      <w:lvlText w:val=""/>
+      <w:lvlJc w:val="left"/>
+      <w:pPr>
+        <w:tabs>
+          <w:tab w:val="num" w:pos="5760"/>
+        </w:tabs>
+        <w:ind w:left="5760" w:hanging="360"/>
+      </w:pPr>
+      <w:rPr>
+        <w:rFonts w:ascii="Wingdings" w:hAnsi="Wingdings" w:hint="default"/>
+        <w:sz w:val="20"/>
+      </w:rPr>
+    </w:lvl>
+    <w:lvl w:ilvl="8" w:tentative="1">
+      <w:start w:val="1"/>
+      <w:numFmt w:val="bullet"/>
+      <w:lvlText w:val=""/>
+      <w:lvlJc w:val="left"/>
+      <w:pPr>
+        <w:tabs>
+          <w:tab w:val="num" w:pos="6480"/>
+        </w:tabs>
+        <w:ind w:left="6480" w:hanging="360"/>
+      </w:pPr>
+      <w:rPr>
+        <w:rFonts w:ascii="Wingdings" w:hAnsi="Wingdings" w:hint="default"/>
+        <w:sz w:val="20"/>
+      </w:rPr>
+    </w:lvl>
+  </w:abstractNum>
+  <w:abstractNum w:abstractNumId="18" w15:restartNumberingAfterBreak="0">
+    <w:nsid w:val="79795795"/>
+    <w:multiLevelType w:val="multilevel"/>
+    <w:tmpl w:val="896A511E"/>
     <w:lvl w:ilvl="0">
       <w:start w:val="1"/>
       <w:numFmt w:val="decimal"/>
@@ -9851,1778 +11558,62 @@
       </w:pPr>
     </w:lvl>
   </w:abstractNum>
-  <w:abstractNum w:abstractNumId="7" w15:restartNumberingAfterBreak="0">
-    <w:nsid w:val="3F91554B"/>
-    <w:multiLevelType w:val="multilevel"/>
-    <w:tmpl w:val="EABCD420"/>
-    <w:lvl w:ilvl="0">
-      <w:start w:val="1"/>
-      <w:numFmt w:val="bullet"/>
-      <w:lvlText w:val=""/>
-      <w:lvlJc w:val="left"/>
-      <w:pPr>
-        <w:tabs>
-          <w:tab w:val="num" w:pos="720"/>
-        </w:tabs>
-        <w:ind w:left="720" w:hanging="360"/>
-      </w:pPr>
-      <w:rPr>
-        <w:rFonts w:ascii="Symbol" w:hAnsi="Symbol" w:hint="default"/>
-        <w:sz w:val="20"/>
-      </w:rPr>
-    </w:lvl>
-    <w:lvl w:ilvl="1" w:tentative="1">
-      <w:start w:val="1"/>
-      <w:numFmt w:val="bullet"/>
-      <w:lvlText w:val="o"/>
-      <w:lvlJc w:val="left"/>
-      <w:pPr>
-        <w:tabs>
-          <w:tab w:val="num" w:pos="1440"/>
-        </w:tabs>
-        <w:ind w:left="1440" w:hanging="360"/>
-      </w:pPr>
-      <w:rPr>
-        <w:rFonts w:ascii="Courier New" w:hAnsi="Courier New" w:hint="default"/>
-        <w:sz w:val="20"/>
-      </w:rPr>
-    </w:lvl>
-    <w:lvl w:ilvl="2" w:tentative="1">
-      <w:start w:val="1"/>
-      <w:numFmt w:val="bullet"/>
-      <w:lvlText w:val=""/>
-      <w:lvlJc w:val="left"/>
-      <w:pPr>
-        <w:tabs>
-          <w:tab w:val="num" w:pos="2160"/>
-        </w:tabs>
-        <w:ind w:left="2160" w:hanging="360"/>
-      </w:pPr>
-      <w:rPr>
-        <w:rFonts w:ascii="Wingdings" w:hAnsi="Wingdings" w:hint="default"/>
-        <w:sz w:val="20"/>
-      </w:rPr>
-    </w:lvl>
-    <w:lvl w:ilvl="3" w:tentative="1">
-      <w:start w:val="1"/>
-      <w:numFmt w:val="bullet"/>
-      <w:lvlText w:val=""/>
-      <w:lvlJc w:val="left"/>
-      <w:pPr>
-        <w:tabs>
-          <w:tab w:val="num" w:pos="2880"/>
-        </w:tabs>
-        <w:ind w:left="2880" w:hanging="360"/>
-      </w:pPr>
-      <w:rPr>
-        <w:rFonts w:ascii="Wingdings" w:hAnsi="Wingdings" w:hint="default"/>
-        <w:sz w:val="20"/>
-      </w:rPr>
-    </w:lvl>
-    <w:lvl w:ilvl="4" w:tentative="1">
-      <w:start w:val="1"/>
-      <w:numFmt w:val="bullet"/>
-      <w:lvlText w:val=""/>
-      <w:lvlJc w:val="left"/>
-      <w:pPr>
-        <w:tabs>
-          <w:tab w:val="num" w:pos="3600"/>
-        </w:tabs>
-        <w:ind w:left="3600" w:hanging="360"/>
-      </w:pPr>
-      <w:rPr>
-        <w:rFonts w:ascii="Wingdings" w:hAnsi="Wingdings" w:hint="default"/>
-        <w:sz w:val="20"/>
-      </w:rPr>
-    </w:lvl>
-    <w:lvl w:ilvl="5" w:tentative="1">
-      <w:start w:val="1"/>
-      <w:numFmt w:val="bullet"/>
-      <w:lvlText w:val=""/>
-      <w:lvlJc w:val="left"/>
-      <w:pPr>
-        <w:tabs>
-          <w:tab w:val="num" w:pos="4320"/>
-        </w:tabs>
-        <w:ind w:left="4320" w:hanging="360"/>
-      </w:pPr>
-      <w:rPr>
-        <w:rFonts w:ascii="Wingdings" w:hAnsi="Wingdings" w:hint="default"/>
-        <w:sz w:val="20"/>
-      </w:rPr>
-    </w:lvl>
-    <w:lvl w:ilvl="6" w:tentative="1">
-      <w:start w:val="1"/>
-      <w:numFmt w:val="bullet"/>
-      <w:lvlText w:val=""/>
-      <w:lvlJc w:val="left"/>
-      <w:pPr>
-        <w:tabs>
-          <w:tab w:val="num" w:pos="5040"/>
-        </w:tabs>
-        <w:ind w:left="5040" w:hanging="360"/>
-      </w:pPr>
-      <w:rPr>
-        <w:rFonts w:ascii="Wingdings" w:hAnsi="Wingdings" w:hint="default"/>
-        <w:sz w:val="20"/>
-      </w:rPr>
-    </w:lvl>
-    <w:lvl w:ilvl="7" w:tentative="1">
-      <w:start w:val="1"/>
-      <w:numFmt w:val="bullet"/>
-      <w:lvlText w:val=""/>
-      <w:lvlJc w:val="left"/>
-      <w:pPr>
-        <w:tabs>
-          <w:tab w:val="num" w:pos="5760"/>
-        </w:tabs>
-        <w:ind w:left="5760" w:hanging="360"/>
-      </w:pPr>
-      <w:rPr>
-        <w:rFonts w:ascii="Wingdings" w:hAnsi="Wingdings" w:hint="default"/>
-        <w:sz w:val="20"/>
-      </w:rPr>
-    </w:lvl>
-    <w:lvl w:ilvl="8" w:tentative="1">
-      <w:start w:val="1"/>
-      <w:numFmt w:val="bullet"/>
-      <w:lvlText w:val=""/>
-      <w:lvlJc w:val="left"/>
-      <w:pPr>
-        <w:tabs>
-          <w:tab w:val="num" w:pos="6480"/>
-        </w:tabs>
-        <w:ind w:left="6480" w:hanging="360"/>
-      </w:pPr>
-      <w:rPr>
-        <w:rFonts w:ascii="Wingdings" w:hAnsi="Wingdings" w:hint="default"/>
-        <w:sz w:val="20"/>
-      </w:rPr>
-    </w:lvl>
-  </w:abstractNum>
-  <w:abstractNum w:abstractNumId="8" w15:restartNumberingAfterBreak="0">
-    <w:nsid w:val="4AE756AE"/>
-    <w:multiLevelType w:val="multilevel"/>
-    <w:tmpl w:val="405A3CA8"/>
-    <w:lvl w:ilvl="0">
-      <w:start w:val="1"/>
-      <w:numFmt w:val="decimal"/>
-      <w:lvlText w:val="%1."/>
-      <w:lvlJc w:val="left"/>
-      <w:pPr>
-        <w:tabs>
-          <w:tab w:val="num" w:pos="720"/>
-        </w:tabs>
-        <w:ind w:left="720" w:hanging="360"/>
-      </w:pPr>
-    </w:lvl>
-    <w:lvl w:ilvl="1" w:tentative="1">
-      <w:start w:val="1"/>
-      <w:numFmt w:val="decimal"/>
-      <w:lvlText w:val="%2."/>
-      <w:lvlJc w:val="left"/>
-      <w:pPr>
-        <w:tabs>
-          <w:tab w:val="num" w:pos="1440"/>
-        </w:tabs>
-        <w:ind w:left="1440" w:hanging="360"/>
-      </w:pPr>
-    </w:lvl>
-    <w:lvl w:ilvl="2" w:tentative="1">
-      <w:start w:val="1"/>
-      <w:numFmt w:val="decimal"/>
-      <w:lvlText w:val="%3."/>
-      <w:lvlJc w:val="left"/>
-      <w:pPr>
-        <w:tabs>
-          <w:tab w:val="num" w:pos="2160"/>
-        </w:tabs>
-        <w:ind w:left="2160" w:hanging="360"/>
-      </w:pPr>
-    </w:lvl>
-    <w:lvl w:ilvl="3" w:tentative="1">
-      <w:start w:val="1"/>
-      <w:numFmt w:val="decimal"/>
-      <w:lvlText w:val="%4."/>
-      <w:lvlJc w:val="left"/>
-      <w:pPr>
-        <w:tabs>
-          <w:tab w:val="num" w:pos="2880"/>
-        </w:tabs>
-        <w:ind w:left="2880" w:hanging="360"/>
-      </w:pPr>
-    </w:lvl>
-    <w:lvl w:ilvl="4" w:tentative="1">
-      <w:start w:val="1"/>
-      <w:numFmt w:val="decimal"/>
-      <w:lvlText w:val="%5."/>
-      <w:lvlJc w:val="left"/>
-      <w:pPr>
-        <w:tabs>
-          <w:tab w:val="num" w:pos="3600"/>
-        </w:tabs>
-        <w:ind w:left="3600" w:hanging="360"/>
-      </w:pPr>
-    </w:lvl>
-    <w:lvl w:ilvl="5" w:tentative="1">
-      <w:start w:val="1"/>
-      <w:numFmt w:val="decimal"/>
-      <w:lvlText w:val="%6."/>
-      <w:lvlJc w:val="left"/>
-      <w:pPr>
-        <w:tabs>
-          <w:tab w:val="num" w:pos="4320"/>
-        </w:tabs>
-        <w:ind w:left="4320" w:hanging="360"/>
-      </w:pPr>
-    </w:lvl>
-    <w:lvl w:ilvl="6" w:tentative="1">
-      <w:start w:val="1"/>
-      <w:numFmt w:val="decimal"/>
-      <w:lvlText w:val="%7."/>
-      <w:lvlJc w:val="left"/>
-      <w:pPr>
-        <w:tabs>
-          <w:tab w:val="num" w:pos="5040"/>
-        </w:tabs>
-        <w:ind w:left="5040" w:hanging="360"/>
-      </w:pPr>
-    </w:lvl>
-    <w:lvl w:ilvl="7" w:tentative="1">
-      <w:start w:val="1"/>
-      <w:numFmt w:val="decimal"/>
-      <w:lvlText w:val="%8."/>
-      <w:lvlJc w:val="left"/>
-      <w:pPr>
-        <w:tabs>
-          <w:tab w:val="num" w:pos="5760"/>
-        </w:tabs>
-        <w:ind w:left="5760" w:hanging="360"/>
-      </w:pPr>
-    </w:lvl>
-    <w:lvl w:ilvl="8" w:tentative="1">
-      <w:start w:val="1"/>
-      <w:numFmt w:val="decimal"/>
-      <w:lvlText w:val="%9."/>
-      <w:lvlJc w:val="left"/>
-      <w:pPr>
-        <w:tabs>
-          <w:tab w:val="num" w:pos="6480"/>
-        </w:tabs>
-        <w:ind w:left="6480" w:hanging="360"/>
-      </w:pPr>
-    </w:lvl>
-  </w:abstractNum>
-  <w:abstractNum w:abstractNumId="9" w15:restartNumberingAfterBreak="0">
-    <w:nsid w:val="4C576A5E"/>
-    <w:multiLevelType w:val="multilevel"/>
-    <w:tmpl w:val="DFD6CD7C"/>
-    <w:lvl w:ilvl="0">
-      <w:start w:val="1"/>
-      <w:numFmt w:val="bullet"/>
-      <w:lvlText w:val=""/>
-      <w:lvlJc w:val="left"/>
-      <w:pPr>
-        <w:tabs>
-          <w:tab w:val="num" w:pos="720"/>
-        </w:tabs>
-        <w:ind w:left="720" w:hanging="360"/>
-      </w:pPr>
-      <w:rPr>
-        <w:rFonts w:ascii="Symbol" w:hAnsi="Symbol" w:hint="default"/>
-        <w:sz w:val="20"/>
-      </w:rPr>
-    </w:lvl>
-    <w:lvl w:ilvl="1" w:tentative="1">
-      <w:start w:val="1"/>
-      <w:numFmt w:val="bullet"/>
-      <w:lvlText w:val="o"/>
-      <w:lvlJc w:val="left"/>
-      <w:pPr>
-        <w:tabs>
-          <w:tab w:val="num" w:pos="1440"/>
-        </w:tabs>
-        <w:ind w:left="1440" w:hanging="360"/>
-      </w:pPr>
-      <w:rPr>
-        <w:rFonts w:ascii="Courier New" w:hAnsi="Courier New" w:hint="default"/>
-        <w:sz w:val="20"/>
-      </w:rPr>
-    </w:lvl>
-    <w:lvl w:ilvl="2" w:tentative="1">
-      <w:start w:val="1"/>
-      <w:numFmt w:val="bullet"/>
-      <w:lvlText w:val=""/>
-      <w:lvlJc w:val="left"/>
-      <w:pPr>
-        <w:tabs>
-          <w:tab w:val="num" w:pos="2160"/>
-        </w:tabs>
-        <w:ind w:left="2160" w:hanging="360"/>
-      </w:pPr>
-      <w:rPr>
-        <w:rFonts w:ascii="Wingdings" w:hAnsi="Wingdings" w:hint="default"/>
-        <w:sz w:val="20"/>
-      </w:rPr>
-    </w:lvl>
-    <w:lvl w:ilvl="3" w:tentative="1">
-      <w:start w:val="1"/>
-      <w:numFmt w:val="bullet"/>
-      <w:lvlText w:val=""/>
-      <w:lvlJc w:val="left"/>
-      <w:pPr>
-        <w:tabs>
-          <w:tab w:val="num" w:pos="2880"/>
-        </w:tabs>
-        <w:ind w:left="2880" w:hanging="360"/>
-      </w:pPr>
-      <w:rPr>
-        <w:rFonts w:ascii="Wingdings" w:hAnsi="Wingdings" w:hint="default"/>
-        <w:sz w:val="20"/>
-      </w:rPr>
-    </w:lvl>
-    <w:lvl w:ilvl="4" w:tentative="1">
-      <w:start w:val="1"/>
-      <w:numFmt w:val="bullet"/>
-      <w:lvlText w:val=""/>
-      <w:lvlJc w:val="left"/>
-      <w:pPr>
-        <w:tabs>
-          <w:tab w:val="num" w:pos="3600"/>
-        </w:tabs>
-        <w:ind w:left="3600" w:hanging="360"/>
-      </w:pPr>
-      <w:rPr>
-        <w:rFonts w:ascii="Wingdings" w:hAnsi="Wingdings" w:hint="default"/>
-        <w:sz w:val="20"/>
-      </w:rPr>
-    </w:lvl>
-    <w:lvl w:ilvl="5" w:tentative="1">
-      <w:start w:val="1"/>
-      <w:numFmt w:val="bullet"/>
-      <w:lvlText w:val=""/>
-      <w:lvlJc w:val="left"/>
-      <w:pPr>
-        <w:tabs>
-          <w:tab w:val="num" w:pos="4320"/>
-        </w:tabs>
-        <w:ind w:left="4320" w:hanging="360"/>
-      </w:pPr>
-      <w:rPr>
-        <w:rFonts w:ascii="Wingdings" w:hAnsi="Wingdings" w:hint="default"/>
-        <w:sz w:val="20"/>
-      </w:rPr>
-    </w:lvl>
-    <w:lvl w:ilvl="6" w:tentative="1">
-      <w:start w:val="1"/>
-      <w:numFmt w:val="bullet"/>
-      <w:lvlText w:val=""/>
-      <w:lvlJc w:val="left"/>
-      <w:pPr>
-        <w:tabs>
-          <w:tab w:val="num" w:pos="5040"/>
-        </w:tabs>
-        <w:ind w:left="5040" w:hanging="360"/>
-      </w:pPr>
-      <w:rPr>
-        <w:rFonts w:ascii="Wingdings" w:hAnsi="Wingdings" w:hint="default"/>
-        <w:sz w:val="20"/>
-      </w:rPr>
-    </w:lvl>
-    <w:lvl w:ilvl="7" w:tentative="1">
-      <w:start w:val="1"/>
-      <w:numFmt w:val="bullet"/>
-      <w:lvlText w:val=""/>
-      <w:lvlJc w:val="left"/>
-      <w:pPr>
-        <w:tabs>
-          <w:tab w:val="num" w:pos="5760"/>
-        </w:tabs>
-        <w:ind w:left="5760" w:hanging="360"/>
-      </w:pPr>
-      <w:rPr>
-        <w:rFonts w:ascii="Wingdings" w:hAnsi="Wingdings" w:hint="default"/>
-        <w:sz w:val="20"/>
-      </w:rPr>
-    </w:lvl>
-    <w:lvl w:ilvl="8" w:tentative="1">
-      <w:start w:val="1"/>
-      <w:numFmt w:val="bullet"/>
-      <w:lvlText w:val=""/>
-      <w:lvlJc w:val="left"/>
-      <w:pPr>
-        <w:tabs>
-          <w:tab w:val="num" w:pos="6480"/>
-        </w:tabs>
-        <w:ind w:left="6480" w:hanging="360"/>
-      </w:pPr>
-      <w:rPr>
-        <w:rFonts w:ascii="Wingdings" w:hAnsi="Wingdings" w:hint="default"/>
-        <w:sz w:val="20"/>
-      </w:rPr>
-    </w:lvl>
-  </w:abstractNum>
-  <w:abstractNum w:abstractNumId="10" w15:restartNumberingAfterBreak="0">
-    <w:nsid w:val="4EFD0A6B"/>
-    <w:multiLevelType w:val="multilevel"/>
-    <w:tmpl w:val="B7B887BC"/>
-    <w:lvl w:ilvl="0">
-      <w:start w:val="1"/>
-      <w:numFmt w:val="bullet"/>
-      <w:lvlText w:val=""/>
-      <w:lvlJc w:val="left"/>
-      <w:pPr>
-        <w:tabs>
-          <w:tab w:val="num" w:pos="720"/>
-        </w:tabs>
-        <w:ind w:left="720" w:hanging="360"/>
-      </w:pPr>
-      <w:rPr>
-        <w:rFonts w:ascii="Symbol" w:hAnsi="Symbol" w:hint="default"/>
-        <w:sz w:val="20"/>
-      </w:rPr>
-    </w:lvl>
-    <w:lvl w:ilvl="1" w:tentative="1">
-      <w:start w:val="1"/>
-      <w:numFmt w:val="bullet"/>
-      <w:lvlText w:val="o"/>
-      <w:lvlJc w:val="left"/>
-      <w:pPr>
-        <w:tabs>
-          <w:tab w:val="num" w:pos="1440"/>
-        </w:tabs>
-        <w:ind w:left="1440" w:hanging="360"/>
-      </w:pPr>
-      <w:rPr>
-        <w:rFonts w:ascii="Courier New" w:hAnsi="Courier New" w:hint="default"/>
-        <w:sz w:val="20"/>
-      </w:rPr>
-    </w:lvl>
-    <w:lvl w:ilvl="2" w:tentative="1">
-      <w:start w:val="1"/>
-      <w:numFmt w:val="bullet"/>
-      <w:lvlText w:val=""/>
-      <w:lvlJc w:val="left"/>
-      <w:pPr>
-        <w:tabs>
-          <w:tab w:val="num" w:pos="2160"/>
-        </w:tabs>
-        <w:ind w:left="2160" w:hanging="360"/>
-      </w:pPr>
-      <w:rPr>
-        <w:rFonts w:ascii="Wingdings" w:hAnsi="Wingdings" w:hint="default"/>
-        <w:sz w:val="20"/>
-      </w:rPr>
-    </w:lvl>
-    <w:lvl w:ilvl="3" w:tentative="1">
-      <w:start w:val="1"/>
-      <w:numFmt w:val="bullet"/>
-      <w:lvlText w:val=""/>
-      <w:lvlJc w:val="left"/>
-      <w:pPr>
-        <w:tabs>
-          <w:tab w:val="num" w:pos="2880"/>
-        </w:tabs>
-        <w:ind w:left="2880" w:hanging="360"/>
-      </w:pPr>
-      <w:rPr>
-        <w:rFonts w:ascii="Wingdings" w:hAnsi="Wingdings" w:hint="default"/>
-        <w:sz w:val="20"/>
-      </w:rPr>
-    </w:lvl>
-    <w:lvl w:ilvl="4" w:tentative="1">
-      <w:start w:val="1"/>
-      <w:numFmt w:val="bullet"/>
-      <w:lvlText w:val=""/>
-      <w:lvlJc w:val="left"/>
-      <w:pPr>
-        <w:tabs>
-          <w:tab w:val="num" w:pos="3600"/>
-        </w:tabs>
-        <w:ind w:left="3600" w:hanging="360"/>
-      </w:pPr>
-      <w:rPr>
-        <w:rFonts w:ascii="Wingdings" w:hAnsi="Wingdings" w:hint="default"/>
-        <w:sz w:val="20"/>
-      </w:rPr>
-    </w:lvl>
-    <w:lvl w:ilvl="5" w:tentative="1">
-      <w:start w:val="1"/>
-      <w:numFmt w:val="bullet"/>
-      <w:lvlText w:val=""/>
-      <w:lvlJc w:val="left"/>
-      <w:pPr>
-        <w:tabs>
-          <w:tab w:val="num" w:pos="4320"/>
-        </w:tabs>
-        <w:ind w:left="4320" w:hanging="360"/>
-      </w:pPr>
-      <w:rPr>
-        <w:rFonts w:ascii="Wingdings" w:hAnsi="Wingdings" w:hint="default"/>
-        <w:sz w:val="20"/>
-      </w:rPr>
-    </w:lvl>
-    <w:lvl w:ilvl="6" w:tentative="1">
-      <w:start w:val="1"/>
-      <w:numFmt w:val="bullet"/>
-      <w:lvlText w:val=""/>
-      <w:lvlJc w:val="left"/>
-      <w:pPr>
-        <w:tabs>
-          <w:tab w:val="num" w:pos="5040"/>
-        </w:tabs>
-        <w:ind w:left="5040" w:hanging="360"/>
-      </w:pPr>
-      <w:rPr>
-        <w:rFonts w:ascii="Wingdings" w:hAnsi="Wingdings" w:hint="default"/>
-        <w:sz w:val="20"/>
-      </w:rPr>
-    </w:lvl>
-    <w:lvl w:ilvl="7" w:tentative="1">
-      <w:start w:val="1"/>
-      <w:numFmt w:val="bullet"/>
-      <w:lvlText w:val=""/>
-      <w:lvlJc w:val="left"/>
-      <w:pPr>
-        <w:tabs>
-          <w:tab w:val="num" w:pos="5760"/>
-        </w:tabs>
-        <w:ind w:left="5760" w:hanging="360"/>
-      </w:pPr>
-      <w:rPr>
-        <w:rFonts w:ascii="Wingdings" w:hAnsi="Wingdings" w:hint="default"/>
-        <w:sz w:val="20"/>
-      </w:rPr>
-    </w:lvl>
-    <w:lvl w:ilvl="8" w:tentative="1">
-      <w:start w:val="1"/>
-      <w:numFmt w:val="bullet"/>
-      <w:lvlText w:val=""/>
-      <w:lvlJc w:val="left"/>
-      <w:pPr>
-        <w:tabs>
-          <w:tab w:val="num" w:pos="6480"/>
-        </w:tabs>
-        <w:ind w:left="6480" w:hanging="360"/>
-      </w:pPr>
-      <w:rPr>
-        <w:rFonts w:ascii="Wingdings" w:hAnsi="Wingdings" w:hint="default"/>
-        <w:sz w:val="20"/>
-      </w:rPr>
-    </w:lvl>
-  </w:abstractNum>
-  <w:abstractNum w:abstractNumId="11" w15:restartNumberingAfterBreak="0">
-    <w:nsid w:val="4F4A1660"/>
-    <w:multiLevelType w:val="multilevel"/>
-    <w:tmpl w:val="1A8CB8CA"/>
-    <w:lvl w:ilvl="0">
-      <w:start w:val="1"/>
-      <w:numFmt w:val="bullet"/>
-      <w:lvlText w:val=""/>
-      <w:lvlJc w:val="left"/>
-      <w:pPr>
-        <w:tabs>
-          <w:tab w:val="num" w:pos="720"/>
-        </w:tabs>
-        <w:ind w:left="720" w:hanging="360"/>
-      </w:pPr>
-      <w:rPr>
-        <w:rFonts w:ascii="Symbol" w:hAnsi="Symbol" w:hint="default"/>
-        <w:sz w:val="20"/>
-      </w:rPr>
-    </w:lvl>
-    <w:lvl w:ilvl="1" w:tentative="1">
-      <w:start w:val="1"/>
-      <w:numFmt w:val="bullet"/>
-      <w:lvlText w:val="o"/>
-      <w:lvlJc w:val="left"/>
-      <w:pPr>
-        <w:tabs>
-          <w:tab w:val="num" w:pos="1440"/>
-        </w:tabs>
-        <w:ind w:left="1440" w:hanging="360"/>
-      </w:pPr>
-      <w:rPr>
-        <w:rFonts w:ascii="Courier New" w:hAnsi="Courier New" w:hint="default"/>
-        <w:sz w:val="20"/>
-      </w:rPr>
-    </w:lvl>
-    <w:lvl w:ilvl="2" w:tentative="1">
-      <w:start w:val="1"/>
-      <w:numFmt w:val="bullet"/>
-      <w:lvlText w:val=""/>
-      <w:lvlJc w:val="left"/>
-      <w:pPr>
-        <w:tabs>
-          <w:tab w:val="num" w:pos="2160"/>
-        </w:tabs>
-        <w:ind w:left="2160" w:hanging="360"/>
-      </w:pPr>
-      <w:rPr>
-        <w:rFonts w:ascii="Wingdings" w:hAnsi="Wingdings" w:hint="default"/>
-        <w:sz w:val="20"/>
-      </w:rPr>
-    </w:lvl>
-    <w:lvl w:ilvl="3" w:tentative="1">
-      <w:start w:val="1"/>
-      <w:numFmt w:val="bullet"/>
-      <w:lvlText w:val=""/>
-      <w:lvlJc w:val="left"/>
-      <w:pPr>
-        <w:tabs>
-          <w:tab w:val="num" w:pos="2880"/>
-        </w:tabs>
-        <w:ind w:left="2880" w:hanging="360"/>
-      </w:pPr>
-      <w:rPr>
-        <w:rFonts w:ascii="Wingdings" w:hAnsi="Wingdings" w:hint="default"/>
-        <w:sz w:val="20"/>
-      </w:rPr>
-    </w:lvl>
-    <w:lvl w:ilvl="4" w:tentative="1">
-      <w:start w:val="1"/>
-      <w:numFmt w:val="bullet"/>
-      <w:lvlText w:val=""/>
-      <w:lvlJc w:val="left"/>
-      <w:pPr>
-        <w:tabs>
-          <w:tab w:val="num" w:pos="3600"/>
-        </w:tabs>
-        <w:ind w:left="3600" w:hanging="360"/>
-      </w:pPr>
-      <w:rPr>
-        <w:rFonts w:ascii="Wingdings" w:hAnsi="Wingdings" w:hint="default"/>
-        <w:sz w:val="20"/>
-      </w:rPr>
-    </w:lvl>
-    <w:lvl w:ilvl="5" w:tentative="1">
-      <w:start w:val="1"/>
-      <w:numFmt w:val="bullet"/>
-      <w:lvlText w:val=""/>
-      <w:lvlJc w:val="left"/>
-      <w:pPr>
-        <w:tabs>
-          <w:tab w:val="num" w:pos="4320"/>
-        </w:tabs>
-        <w:ind w:left="4320" w:hanging="360"/>
-      </w:pPr>
-      <w:rPr>
-        <w:rFonts w:ascii="Wingdings" w:hAnsi="Wingdings" w:hint="default"/>
-        <w:sz w:val="20"/>
-      </w:rPr>
-    </w:lvl>
-    <w:lvl w:ilvl="6" w:tentative="1">
-      <w:start w:val="1"/>
-      <w:numFmt w:val="bullet"/>
-      <w:lvlText w:val=""/>
-      <w:lvlJc w:val="left"/>
-      <w:pPr>
-        <w:tabs>
-          <w:tab w:val="num" w:pos="5040"/>
-        </w:tabs>
-        <w:ind w:left="5040" w:hanging="360"/>
-      </w:pPr>
-      <w:rPr>
-        <w:rFonts w:ascii="Wingdings" w:hAnsi="Wingdings" w:hint="default"/>
-        <w:sz w:val="20"/>
-      </w:rPr>
-    </w:lvl>
-    <w:lvl w:ilvl="7" w:tentative="1">
-      <w:start w:val="1"/>
-      <w:numFmt w:val="bullet"/>
-      <w:lvlText w:val=""/>
-      <w:lvlJc w:val="left"/>
-      <w:pPr>
-        <w:tabs>
-          <w:tab w:val="num" w:pos="5760"/>
-        </w:tabs>
-        <w:ind w:left="5760" w:hanging="360"/>
-      </w:pPr>
-      <w:rPr>
-        <w:rFonts w:ascii="Wingdings" w:hAnsi="Wingdings" w:hint="default"/>
-        <w:sz w:val="20"/>
-      </w:rPr>
-    </w:lvl>
-    <w:lvl w:ilvl="8" w:tentative="1">
-      <w:start w:val="1"/>
-      <w:numFmt w:val="bullet"/>
-      <w:lvlText w:val=""/>
-      <w:lvlJc w:val="left"/>
-      <w:pPr>
-        <w:tabs>
-          <w:tab w:val="num" w:pos="6480"/>
-        </w:tabs>
-        <w:ind w:left="6480" w:hanging="360"/>
-      </w:pPr>
-      <w:rPr>
-        <w:rFonts w:ascii="Wingdings" w:hAnsi="Wingdings" w:hint="default"/>
-        <w:sz w:val="20"/>
-      </w:rPr>
-    </w:lvl>
-  </w:abstractNum>
-  <w:abstractNum w:abstractNumId="12" w15:restartNumberingAfterBreak="0">
-    <w:nsid w:val="53AE046A"/>
-    <w:multiLevelType w:val="multilevel"/>
-    <w:tmpl w:val="2F3C9FF6"/>
-    <w:lvl w:ilvl="0">
-      <w:start w:val="1"/>
-      <w:numFmt w:val="bullet"/>
-      <w:lvlText w:val=""/>
-      <w:lvlJc w:val="left"/>
-      <w:pPr>
-        <w:tabs>
-          <w:tab w:val="num" w:pos="720"/>
-        </w:tabs>
-        <w:ind w:left="720" w:hanging="360"/>
-      </w:pPr>
-      <w:rPr>
-        <w:rFonts w:ascii="Symbol" w:hAnsi="Symbol" w:hint="default"/>
-        <w:sz w:val="20"/>
-      </w:rPr>
-    </w:lvl>
-    <w:lvl w:ilvl="1" w:tentative="1">
-      <w:start w:val="1"/>
-      <w:numFmt w:val="bullet"/>
-      <w:lvlText w:val="o"/>
-      <w:lvlJc w:val="left"/>
-      <w:pPr>
-        <w:tabs>
-          <w:tab w:val="num" w:pos="1440"/>
-        </w:tabs>
-        <w:ind w:left="1440" w:hanging="360"/>
-      </w:pPr>
-      <w:rPr>
-        <w:rFonts w:ascii="Courier New" w:hAnsi="Courier New" w:hint="default"/>
-        <w:sz w:val="20"/>
-      </w:rPr>
-    </w:lvl>
-    <w:lvl w:ilvl="2" w:tentative="1">
-      <w:start w:val="1"/>
-      <w:numFmt w:val="bullet"/>
-      <w:lvlText w:val=""/>
-      <w:lvlJc w:val="left"/>
-      <w:pPr>
-        <w:tabs>
-          <w:tab w:val="num" w:pos="2160"/>
-        </w:tabs>
-        <w:ind w:left="2160" w:hanging="360"/>
-      </w:pPr>
-      <w:rPr>
-        <w:rFonts w:ascii="Wingdings" w:hAnsi="Wingdings" w:hint="default"/>
-        <w:sz w:val="20"/>
-      </w:rPr>
-    </w:lvl>
-    <w:lvl w:ilvl="3" w:tentative="1">
-      <w:start w:val="1"/>
-      <w:numFmt w:val="bullet"/>
-      <w:lvlText w:val=""/>
-      <w:lvlJc w:val="left"/>
-      <w:pPr>
-        <w:tabs>
-          <w:tab w:val="num" w:pos="2880"/>
-        </w:tabs>
-        <w:ind w:left="2880" w:hanging="360"/>
-      </w:pPr>
-      <w:rPr>
-        <w:rFonts w:ascii="Wingdings" w:hAnsi="Wingdings" w:hint="default"/>
-        <w:sz w:val="20"/>
-      </w:rPr>
-    </w:lvl>
-    <w:lvl w:ilvl="4" w:tentative="1">
-      <w:start w:val="1"/>
-      <w:numFmt w:val="bullet"/>
-      <w:lvlText w:val=""/>
-      <w:lvlJc w:val="left"/>
-      <w:pPr>
-        <w:tabs>
-          <w:tab w:val="num" w:pos="3600"/>
-        </w:tabs>
-        <w:ind w:left="3600" w:hanging="360"/>
-      </w:pPr>
-      <w:rPr>
-        <w:rFonts w:ascii="Wingdings" w:hAnsi="Wingdings" w:hint="default"/>
-        <w:sz w:val="20"/>
-      </w:rPr>
-    </w:lvl>
-    <w:lvl w:ilvl="5" w:tentative="1">
-      <w:start w:val="1"/>
-      <w:numFmt w:val="bullet"/>
-      <w:lvlText w:val=""/>
-      <w:lvlJc w:val="left"/>
-      <w:pPr>
-        <w:tabs>
-          <w:tab w:val="num" w:pos="4320"/>
-        </w:tabs>
-        <w:ind w:left="4320" w:hanging="360"/>
-      </w:pPr>
-      <w:rPr>
-        <w:rFonts w:ascii="Wingdings" w:hAnsi="Wingdings" w:hint="default"/>
-        <w:sz w:val="20"/>
-      </w:rPr>
-    </w:lvl>
-    <w:lvl w:ilvl="6" w:tentative="1">
-      <w:start w:val="1"/>
-      <w:numFmt w:val="bullet"/>
-      <w:lvlText w:val=""/>
-      <w:lvlJc w:val="left"/>
-      <w:pPr>
-        <w:tabs>
-          <w:tab w:val="num" w:pos="5040"/>
-        </w:tabs>
-        <w:ind w:left="5040" w:hanging="360"/>
-      </w:pPr>
-      <w:rPr>
-        <w:rFonts w:ascii="Wingdings" w:hAnsi="Wingdings" w:hint="default"/>
-        <w:sz w:val="20"/>
-      </w:rPr>
-    </w:lvl>
-    <w:lvl w:ilvl="7" w:tentative="1">
-      <w:start w:val="1"/>
-      <w:numFmt w:val="bullet"/>
-      <w:lvlText w:val=""/>
-      <w:lvlJc w:val="left"/>
-      <w:pPr>
-        <w:tabs>
-          <w:tab w:val="num" w:pos="5760"/>
-        </w:tabs>
-        <w:ind w:left="5760" w:hanging="360"/>
-      </w:pPr>
-      <w:rPr>
-        <w:rFonts w:ascii="Wingdings" w:hAnsi="Wingdings" w:hint="default"/>
-        <w:sz w:val="20"/>
-      </w:rPr>
-    </w:lvl>
-    <w:lvl w:ilvl="8" w:tentative="1">
-      <w:start w:val="1"/>
-      <w:numFmt w:val="bullet"/>
-      <w:lvlText w:val=""/>
-      <w:lvlJc w:val="left"/>
-      <w:pPr>
-        <w:tabs>
-          <w:tab w:val="num" w:pos="6480"/>
-        </w:tabs>
-        <w:ind w:left="6480" w:hanging="360"/>
-      </w:pPr>
-      <w:rPr>
-        <w:rFonts w:ascii="Wingdings" w:hAnsi="Wingdings" w:hint="default"/>
-        <w:sz w:val="20"/>
-      </w:rPr>
-    </w:lvl>
-  </w:abstractNum>
-  <w:abstractNum w:abstractNumId="13" w15:restartNumberingAfterBreak="0">
-    <w:nsid w:val="64B8287F"/>
-    <w:multiLevelType w:val="multilevel"/>
-    <w:tmpl w:val="AFDC0912"/>
-    <w:lvl w:ilvl="0">
-      <w:start w:val="1"/>
-      <w:numFmt w:val="bullet"/>
-      <w:lvlText w:val=""/>
-      <w:lvlJc w:val="left"/>
-      <w:pPr>
-        <w:tabs>
-          <w:tab w:val="num" w:pos="720"/>
-        </w:tabs>
-        <w:ind w:left="720" w:hanging="360"/>
-      </w:pPr>
-      <w:rPr>
-        <w:rFonts w:ascii="Symbol" w:hAnsi="Symbol" w:hint="default"/>
-        <w:sz w:val="20"/>
-      </w:rPr>
-    </w:lvl>
-    <w:lvl w:ilvl="1" w:tentative="1">
-      <w:start w:val="1"/>
-      <w:numFmt w:val="bullet"/>
-      <w:lvlText w:val="o"/>
-      <w:lvlJc w:val="left"/>
-      <w:pPr>
-        <w:tabs>
-          <w:tab w:val="num" w:pos="1440"/>
-        </w:tabs>
-        <w:ind w:left="1440" w:hanging="360"/>
-      </w:pPr>
-      <w:rPr>
-        <w:rFonts w:ascii="Courier New" w:hAnsi="Courier New" w:hint="default"/>
-        <w:sz w:val="20"/>
-      </w:rPr>
-    </w:lvl>
-    <w:lvl w:ilvl="2" w:tentative="1">
-      <w:start w:val="1"/>
-      <w:numFmt w:val="bullet"/>
-      <w:lvlText w:val=""/>
-      <w:lvlJc w:val="left"/>
-      <w:pPr>
-        <w:tabs>
-          <w:tab w:val="num" w:pos="2160"/>
-        </w:tabs>
-        <w:ind w:left="2160" w:hanging="360"/>
-      </w:pPr>
-      <w:rPr>
-        <w:rFonts w:ascii="Wingdings" w:hAnsi="Wingdings" w:hint="default"/>
-        <w:sz w:val="20"/>
-      </w:rPr>
-    </w:lvl>
-    <w:lvl w:ilvl="3" w:tentative="1">
-      <w:start w:val="1"/>
-      <w:numFmt w:val="bullet"/>
-      <w:lvlText w:val=""/>
-      <w:lvlJc w:val="left"/>
-      <w:pPr>
-        <w:tabs>
-          <w:tab w:val="num" w:pos="2880"/>
-        </w:tabs>
-        <w:ind w:left="2880" w:hanging="360"/>
-      </w:pPr>
-      <w:rPr>
-        <w:rFonts w:ascii="Wingdings" w:hAnsi="Wingdings" w:hint="default"/>
-        <w:sz w:val="20"/>
-      </w:rPr>
-    </w:lvl>
-    <w:lvl w:ilvl="4" w:tentative="1">
-      <w:start w:val="1"/>
-      <w:numFmt w:val="bullet"/>
-      <w:lvlText w:val=""/>
-      <w:lvlJc w:val="left"/>
-      <w:pPr>
-        <w:tabs>
-          <w:tab w:val="num" w:pos="3600"/>
-        </w:tabs>
-        <w:ind w:left="3600" w:hanging="360"/>
-      </w:pPr>
-      <w:rPr>
-        <w:rFonts w:ascii="Wingdings" w:hAnsi="Wingdings" w:hint="default"/>
-        <w:sz w:val="20"/>
-      </w:rPr>
-    </w:lvl>
-    <w:lvl w:ilvl="5" w:tentative="1">
-      <w:start w:val="1"/>
-      <w:numFmt w:val="bullet"/>
-      <w:lvlText w:val=""/>
-      <w:lvlJc w:val="left"/>
-      <w:pPr>
-        <w:tabs>
-          <w:tab w:val="num" w:pos="4320"/>
-        </w:tabs>
-        <w:ind w:left="4320" w:hanging="360"/>
-      </w:pPr>
-      <w:rPr>
-        <w:rFonts w:ascii="Wingdings" w:hAnsi="Wingdings" w:hint="default"/>
-        <w:sz w:val="20"/>
-      </w:rPr>
-    </w:lvl>
-    <w:lvl w:ilvl="6" w:tentative="1">
-      <w:start w:val="1"/>
-      <w:numFmt w:val="bullet"/>
-      <w:lvlText w:val=""/>
-      <w:lvlJc w:val="left"/>
-      <w:pPr>
-        <w:tabs>
-          <w:tab w:val="num" w:pos="5040"/>
-        </w:tabs>
-        <w:ind w:left="5040" w:hanging="360"/>
-      </w:pPr>
-      <w:rPr>
-        <w:rFonts w:ascii="Wingdings" w:hAnsi="Wingdings" w:hint="default"/>
-        <w:sz w:val="20"/>
-      </w:rPr>
-    </w:lvl>
-    <w:lvl w:ilvl="7" w:tentative="1">
-      <w:start w:val="1"/>
-      <w:numFmt w:val="bullet"/>
-      <w:lvlText w:val=""/>
-      <w:lvlJc w:val="left"/>
-      <w:pPr>
-        <w:tabs>
-          <w:tab w:val="num" w:pos="5760"/>
-        </w:tabs>
-        <w:ind w:left="5760" w:hanging="360"/>
-      </w:pPr>
-      <w:rPr>
-        <w:rFonts w:ascii="Wingdings" w:hAnsi="Wingdings" w:hint="default"/>
-        <w:sz w:val="20"/>
-      </w:rPr>
-    </w:lvl>
-    <w:lvl w:ilvl="8" w:tentative="1">
-      <w:start w:val="1"/>
-      <w:numFmt w:val="bullet"/>
-      <w:lvlText w:val=""/>
-      <w:lvlJc w:val="left"/>
-      <w:pPr>
-        <w:tabs>
-          <w:tab w:val="num" w:pos="6480"/>
-        </w:tabs>
-        <w:ind w:left="6480" w:hanging="360"/>
-      </w:pPr>
-      <w:rPr>
-        <w:rFonts w:ascii="Wingdings" w:hAnsi="Wingdings" w:hint="default"/>
-        <w:sz w:val="20"/>
-      </w:rPr>
-    </w:lvl>
-  </w:abstractNum>
-  <w:abstractNum w:abstractNumId="14" w15:restartNumberingAfterBreak="0">
-    <w:nsid w:val="715A55F9"/>
-    <w:multiLevelType w:val="multilevel"/>
-    <w:tmpl w:val="FB42A212"/>
-    <w:lvl w:ilvl="0">
-      <w:start w:val="1"/>
-      <w:numFmt w:val="bullet"/>
-      <w:lvlText w:val=""/>
-      <w:lvlJc w:val="left"/>
-      <w:pPr>
-        <w:tabs>
-          <w:tab w:val="num" w:pos="720"/>
-        </w:tabs>
-        <w:ind w:left="720" w:hanging="360"/>
-      </w:pPr>
-      <w:rPr>
-        <w:rFonts w:ascii="Symbol" w:hAnsi="Symbol" w:hint="default"/>
-        <w:sz w:val="20"/>
-      </w:rPr>
-    </w:lvl>
-    <w:lvl w:ilvl="1" w:tentative="1">
-      <w:start w:val="1"/>
-      <w:numFmt w:val="bullet"/>
-      <w:lvlText w:val="o"/>
-      <w:lvlJc w:val="left"/>
-      <w:pPr>
-        <w:tabs>
-          <w:tab w:val="num" w:pos="1440"/>
-        </w:tabs>
-        <w:ind w:left="1440" w:hanging="360"/>
-      </w:pPr>
-      <w:rPr>
-        <w:rFonts w:ascii="Courier New" w:hAnsi="Courier New" w:hint="default"/>
-        <w:sz w:val="20"/>
-      </w:rPr>
-    </w:lvl>
-    <w:lvl w:ilvl="2" w:tentative="1">
-      <w:start w:val="1"/>
-      <w:numFmt w:val="bullet"/>
-      <w:lvlText w:val=""/>
-      <w:lvlJc w:val="left"/>
-      <w:pPr>
-        <w:tabs>
-          <w:tab w:val="num" w:pos="2160"/>
-        </w:tabs>
-        <w:ind w:left="2160" w:hanging="360"/>
-      </w:pPr>
-      <w:rPr>
-        <w:rFonts w:ascii="Wingdings" w:hAnsi="Wingdings" w:hint="default"/>
-        <w:sz w:val="20"/>
-      </w:rPr>
-    </w:lvl>
-    <w:lvl w:ilvl="3" w:tentative="1">
-      <w:start w:val="1"/>
-      <w:numFmt w:val="bullet"/>
-      <w:lvlText w:val=""/>
-      <w:lvlJc w:val="left"/>
-      <w:pPr>
-        <w:tabs>
-          <w:tab w:val="num" w:pos="2880"/>
-        </w:tabs>
-        <w:ind w:left="2880" w:hanging="360"/>
-      </w:pPr>
-      <w:rPr>
-        <w:rFonts w:ascii="Wingdings" w:hAnsi="Wingdings" w:hint="default"/>
-        <w:sz w:val="20"/>
-      </w:rPr>
-    </w:lvl>
-    <w:lvl w:ilvl="4" w:tentative="1">
-      <w:start w:val="1"/>
-      <w:numFmt w:val="bullet"/>
-      <w:lvlText w:val=""/>
-      <w:lvlJc w:val="left"/>
-      <w:pPr>
-        <w:tabs>
-          <w:tab w:val="num" w:pos="3600"/>
-        </w:tabs>
-        <w:ind w:left="3600" w:hanging="360"/>
-      </w:pPr>
-      <w:rPr>
-        <w:rFonts w:ascii="Wingdings" w:hAnsi="Wingdings" w:hint="default"/>
-        <w:sz w:val="20"/>
-      </w:rPr>
-    </w:lvl>
-    <w:lvl w:ilvl="5" w:tentative="1">
-      <w:start w:val="1"/>
-      <w:numFmt w:val="bullet"/>
-      <w:lvlText w:val=""/>
-      <w:lvlJc w:val="left"/>
-      <w:pPr>
-        <w:tabs>
-          <w:tab w:val="num" w:pos="4320"/>
-        </w:tabs>
-        <w:ind w:left="4320" w:hanging="360"/>
-      </w:pPr>
-      <w:rPr>
-        <w:rFonts w:ascii="Wingdings" w:hAnsi="Wingdings" w:hint="default"/>
-        <w:sz w:val="20"/>
-      </w:rPr>
-    </w:lvl>
-    <w:lvl w:ilvl="6" w:tentative="1">
-      <w:start w:val="1"/>
-      <w:numFmt w:val="bullet"/>
-      <w:lvlText w:val=""/>
-      <w:lvlJc w:val="left"/>
-      <w:pPr>
-        <w:tabs>
-          <w:tab w:val="num" w:pos="5040"/>
-        </w:tabs>
-        <w:ind w:left="5040" w:hanging="360"/>
-      </w:pPr>
-      <w:rPr>
-        <w:rFonts w:ascii="Wingdings" w:hAnsi="Wingdings" w:hint="default"/>
-        <w:sz w:val="20"/>
-      </w:rPr>
-    </w:lvl>
-    <w:lvl w:ilvl="7" w:tentative="1">
-      <w:start w:val="1"/>
-      <w:numFmt w:val="bullet"/>
-      <w:lvlText w:val=""/>
-      <w:lvlJc w:val="left"/>
-      <w:pPr>
-        <w:tabs>
-          <w:tab w:val="num" w:pos="5760"/>
-        </w:tabs>
-        <w:ind w:left="5760" w:hanging="360"/>
-      </w:pPr>
-      <w:rPr>
-        <w:rFonts w:ascii="Wingdings" w:hAnsi="Wingdings" w:hint="default"/>
-        <w:sz w:val="20"/>
-      </w:rPr>
-    </w:lvl>
-    <w:lvl w:ilvl="8" w:tentative="1">
-      <w:start w:val="1"/>
-      <w:numFmt w:val="bullet"/>
-      <w:lvlText w:val=""/>
-      <w:lvlJc w:val="left"/>
-      <w:pPr>
-        <w:tabs>
-          <w:tab w:val="num" w:pos="6480"/>
-        </w:tabs>
-        <w:ind w:left="6480" w:hanging="360"/>
-      </w:pPr>
-      <w:rPr>
-        <w:rFonts w:ascii="Wingdings" w:hAnsi="Wingdings" w:hint="default"/>
-        <w:sz w:val="20"/>
-      </w:rPr>
-    </w:lvl>
-  </w:abstractNum>
-  <w:abstractNum w:abstractNumId="15" w15:restartNumberingAfterBreak="0">
-    <w:nsid w:val="72B96FC9"/>
-    <w:multiLevelType w:val="multilevel"/>
-    <w:tmpl w:val="860A8D42"/>
-    <w:lvl w:ilvl="0">
-      <w:start w:val="1"/>
-      <w:numFmt w:val="decimal"/>
-      <w:lvlText w:val="%1."/>
-      <w:lvlJc w:val="left"/>
-      <w:pPr>
-        <w:tabs>
-          <w:tab w:val="num" w:pos="720"/>
-        </w:tabs>
-        <w:ind w:left="720" w:hanging="360"/>
-      </w:pPr>
-    </w:lvl>
-    <w:lvl w:ilvl="1" w:tentative="1">
-      <w:start w:val="1"/>
-      <w:numFmt w:val="decimal"/>
-      <w:lvlText w:val="%2."/>
-      <w:lvlJc w:val="left"/>
-      <w:pPr>
-        <w:tabs>
-          <w:tab w:val="num" w:pos="1440"/>
-        </w:tabs>
-        <w:ind w:left="1440" w:hanging="360"/>
-      </w:pPr>
-    </w:lvl>
-    <w:lvl w:ilvl="2" w:tentative="1">
-      <w:start w:val="1"/>
-      <w:numFmt w:val="decimal"/>
-      <w:lvlText w:val="%3."/>
-      <w:lvlJc w:val="left"/>
-      <w:pPr>
-        <w:tabs>
-          <w:tab w:val="num" w:pos="2160"/>
-        </w:tabs>
-        <w:ind w:left="2160" w:hanging="360"/>
-      </w:pPr>
-    </w:lvl>
-    <w:lvl w:ilvl="3" w:tentative="1">
-      <w:start w:val="1"/>
-      <w:numFmt w:val="decimal"/>
-      <w:lvlText w:val="%4."/>
-      <w:lvlJc w:val="left"/>
-      <w:pPr>
-        <w:tabs>
-          <w:tab w:val="num" w:pos="2880"/>
-        </w:tabs>
-        <w:ind w:left="2880" w:hanging="360"/>
-      </w:pPr>
-    </w:lvl>
-    <w:lvl w:ilvl="4" w:tentative="1">
-      <w:start w:val="1"/>
-      <w:numFmt w:val="decimal"/>
-      <w:lvlText w:val="%5."/>
-      <w:lvlJc w:val="left"/>
-      <w:pPr>
-        <w:tabs>
-          <w:tab w:val="num" w:pos="3600"/>
-        </w:tabs>
-        <w:ind w:left="3600" w:hanging="360"/>
-      </w:pPr>
-    </w:lvl>
-    <w:lvl w:ilvl="5" w:tentative="1">
-      <w:start w:val="1"/>
-      <w:numFmt w:val="decimal"/>
-      <w:lvlText w:val="%6."/>
-      <w:lvlJc w:val="left"/>
-      <w:pPr>
-        <w:tabs>
-          <w:tab w:val="num" w:pos="4320"/>
-        </w:tabs>
-        <w:ind w:left="4320" w:hanging="360"/>
-      </w:pPr>
-    </w:lvl>
-    <w:lvl w:ilvl="6" w:tentative="1">
-      <w:start w:val="1"/>
-      <w:numFmt w:val="decimal"/>
-      <w:lvlText w:val="%7."/>
-      <w:lvlJc w:val="left"/>
-      <w:pPr>
-        <w:tabs>
-          <w:tab w:val="num" w:pos="5040"/>
-        </w:tabs>
-        <w:ind w:left="5040" w:hanging="360"/>
-      </w:pPr>
-    </w:lvl>
-    <w:lvl w:ilvl="7" w:tentative="1">
-      <w:start w:val="1"/>
-      <w:numFmt w:val="decimal"/>
-      <w:lvlText w:val="%8."/>
-      <w:lvlJc w:val="left"/>
-      <w:pPr>
-        <w:tabs>
-          <w:tab w:val="num" w:pos="5760"/>
-        </w:tabs>
-        <w:ind w:left="5760" w:hanging="360"/>
-      </w:pPr>
-    </w:lvl>
-    <w:lvl w:ilvl="8" w:tentative="1">
-      <w:start w:val="1"/>
-      <w:numFmt w:val="decimal"/>
-      <w:lvlText w:val="%9."/>
-      <w:lvlJc w:val="left"/>
-      <w:pPr>
-        <w:tabs>
-          <w:tab w:val="num" w:pos="6480"/>
-        </w:tabs>
-        <w:ind w:left="6480" w:hanging="360"/>
-      </w:pPr>
-    </w:lvl>
-  </w:abstractNum>
-  <w:abstractNum w:abstractNumId="16" w15:restartNumberingAfterBreak="0">
-    <w:nsid w:val="743152B5"/>
-    <w:multiLevelType w:val="multilevel"/>
-    <w:tmpl w:val="614AB72E"/>
-    <w:lvl w:ilvl="0">
-      <w:start w:val="1"/>
-      <w:numFmt w:val="bullet"/>
-      <w:lvlText w:val=""/>
-      <w:lvlJc w:val="left"/>
-      <w:pPr>
-        <w:tabs>
-          <w:tab w:val="num" w:pos="720"/>
-        </w:tabs>
-        <w:ind w:left="720" w:hanging="360"/>
-      </w:pPr>
-      <w:rPr>
-        <w:rFonts w:ascii="Symbol" w:hAnsi="Symbol" w:hint="default"/>
-        <w:sz w:val="20"/>
-      </w:rPr>
-    </w:lvl>
-    <w:lvl w:ilvl="1" w:tentative="1">
-      <w:start w:val="1"/>
-      <w:numFmt w:val="bullet"/>
-      <w:lvlText w:val="o"/>
-      <w:lvlJc w:val="left"/>
-      <w:pPr>
-        <w:tabs>
-          <w:tab w:val="num" w:pos="1440"/>
-        </w:tabs>
-        <w:ind w:left="1440" w:hanging="360"/>
-      </w:pPr>
-      <w:rPr>
-        <w:rFonts w:ascii="Courier New" w:hAnsi="Courier New" w:hint="default"/>
-        <w:sz w:val="20"/>
-      </w:rPr>
-    </w:lvl>
-    <w:lvl w:ilvl="2" w:tentative="1">
-      <w:start w:val="1"/>
-      <w:numFmt w:val="bullet"/>
-      <w:lvlText w:val=""/>
-      <w:lvlJc w:val="left"/>
-      <w:pPr>
-        <w:tabs>
-          <w:tab w:val="num" w:pos="2160"/>
-        </w:tabs>
-        <w:ind w:left="2160" w:hanging="360"/>
-      </w:pPr>
-      <w:rPr>
-        <w:rFonts w:ascii="Wingdings" w:hAnsi="Wingdings" w:hint="default"/>
-        <w:sz w:val="20"/>
-      </w:rPr>
-    </w:lvl>
-    <w:lvl w:ilvl="3" w:tentative="1">
-      <w:start w:val="1"/>
-      <w:numFmt w:val="bullet"/>
-      <w:lvlText w:val=""/>
-      <w:lvlJc w:val="left"/>
-      <w:pPr>
-        <w:tabs>
-          <w:tab w:val="num" w:pos="2880"/>
-        </w:tabs>
-        <w:ind w:left="2880" w:hanging="360"/>
-      </w:pPr>
-      <w:rPr>
-        <w:rFonts w:ascii="Wingdings" w:hAnsi="Wingdings" w:hint="default"/>
-        <w:sz w:val="20"/>
-      </w:rPr>
-    </w:lvl>
-    <w:lvl w:ilvl="4" w:tentative="1">
-      <w:start w:val="1"/>
-      <w:numFmt w:val="bullet"/>
-      <w:lvlText w:val=""/>
-      <w:lvlJc w:val="left"/>
-      <w:pPr>
-        <w:tabs>
-          <w:tab w:val="num" w:pos="3600"/>
-        </w:tabs>
-        <w:ind w:left="3600" w:hanging="360"/>
-      </w:pPr>
-      <w:rPr>
-        <w:rFonts w:ascii="Wingdings" w:hAnsi="Wingdings" w:hint="default"/>
-        <w:sz w:val="20"/>
-      </w:rPr>
-    </w:lvl>
-    <w:lvl w:ilvl="5" w:tentative="1">
-      <w:start w:val="1"/>
-      <w:numFmt w:val="bullet"/>
-      <w:lvlText w:val=""/>
-      <w:lvlJc w:val="left"/>
-      <w:pPr>
-        <w:tabs>
-          <w:tab w:val="num" w:pos="4320"/>
-        </w:tabs>
-        <w:ind w:left="4320" w:hanging="360"/>
-      </w:pPr>
-      <w:rPr>
-        <w:rFonts w:ascii="Wingdings" w:hAnsi="Wingdings" w:hint="default"/>
-        <w:sz w:val="20"/>
-      </w:rPr>
-    </w:lvl>
-    <w:lvl w:ilvl="6" w:tentative="1">
-      <w:start w:val="1"/>
-      <w:numFmt w:val="bullet"/>
-      <w:lvlText w:val=""/>
-      <w:lvlJc w:val="left"/>
-      <w:pPr>
-        <w:tabs>
-          <w:tab w:val="num" w:pos="5040"/>
-        </w:tabs>
-        <w:ind w:left="5040" w:hanging="360"/>
-      </w:pPr>
-      <w:rPr>
-        <w:rFonts w:ascii="Wingdings" w:hAnsi="Wingdings" w:hint="default"/>
-        <w:sz w:val="20"/>
-      </w:rPr>
-    </w:lvl>
-    <w:lvl w:ilvl="7" w:tentative="1">
-      <w:start w:val="1"/>
-      <w:numFmt w:val="bullet"/>
-      <w:lvlText w:val=""/>
-      <w:lvlJc w:val="left"/>
-      <w:pPr>
-        <w:tabs>
-          <w:tab w:val="num" w:pos="5760"/>
-        </w:tabs>
-        <w:ind w:left="5760" w:hanging="360"/>
-      </w:pPr>
-      <w:rPr>
-        <w:rFonts w:ascii="Wingdings" w:hAnsi="Wingdings" w:hint="default"/>
-        <w:sz w:val="20"/>
-      </w:rPr>
-    </w:lvl>
-    <w:lvl w:ilvl="8" w:tentative="1">
-      <w:start w:val="1"/>
-      <w:numFmt w:val="bullet"/>
-      <w:lvlText w:val=""/>
-      <w:lvlJc w:val="left"/>
-      <w:pPr>
-        <w:tabs>
-          <w:tab w:val="num" w:pos="6480"/>
-        </w:tabs>
-        <w:ind w:left="6480" w:hanging="360"/>
-      </w:pPr>
-      <w:rPr>
-        <w:rFonts w:ascii="Wingdings" w:hAnsi="Wingdings" w:hint="default"/>
-        <w:sz w:val="20"/>
-      </w:rPr>
-    </w:lvl>
-  </w:abstractNum>
-  <w:abstractNum w:abstractNumId="17" w15:restartNumberingAfterBreak="0">
-    <w:nsid w:val="74EB2E8F"/>
-    <w:multiLevelType w:val="multilevel"/>
-    <w:tmpl w:val="B3B6CFFE"/>
-    <w:lvl w:ilvl="0">
-      <w:start w:val="1"/>
-      <w:numFmt w:val="bullet"/>
-      <w:lvlText w:val=""/>
-      <w:lvlJc w:val="left"/>
-      <w:pPr>
-        <w:tabs>
-          <w:tab w:val="num" w:pos="720"/>
-        </w:tabs>
-        <w:ind w:left="720" w:hanging="360"/>
-      </w:pPr>
-      <w:rPr>
-        <w:rFonts w:ascii="Symbol" w:hAnsi="Symbol" w:hint="default"/>
-        <w:sz w:val="20"/>
-      </w:rPr>
-    </w:lvl>
-    <w:lvl w:ilvl="1" w:tentative="1">
-      <w:start w:val="1"/>
-      <w:numFmt w:val="bullet"/>
-      <w:lvlText w:val="o"/>
-      <w:lvlJc w:val="left"/>
-      <w:pPr>
-        <w:tabs>
-          <w:tab w:val="num" w:pos="1440"/>
-        </w:tabs>
-        <w:ind w:left="1440" w:hanging="360"/>
-      </w:pPr>
-      <w:rPr>
-        <w:rFonts w:ascii="Courier New" w:hAnsi="Courier New" w:hint="default"/>
-        <w:sz w:val="20"/>
-      </w:rPr>
-    </w:lvl>
-    <w:lvl w:ilvl="2" w:tentative="1">
-      <w:start w:val="1"/>
-      <w:numFmt w:val="bullet"/>
-      <w:lvlText w:val=""/>
-      <w:lvlJc w:val="left"/>
-      <w:pPr>
-        <w:tabs>
-          <w:tab w:val="num" w:pos="2160"/>
-        </w:tabs>
-        <w:ind w:left="2160" w:hanging="360"/>
-      </w:pPr>
-      <w:rPr>
-        <w:rFonts w:ascii="Wingdings" w:hAnsi="Wingdings" w:hint="default"/>
-        <w:sz w:val="20"/>
-      </w:rPr>
-    </w:lvl>
-    <w:lvl w:ilvl="3" w:tentative="1">
-      <w:start w:val="1"/>
-      <w:numFmt w:val="bullet"/>
-      <w:lvlText w:val=""/>
-      <w:lvlJc w:val="left"/>
-      <w:pPr>
-        <w:tabs>
-          <w:tab w:val="num" w:pos="2880"/>
-        </w:tabs>
-        <w:ind w:left="2880" w:hanging="360"/>
-      </w:pPr>
-      <w:rPr>
-        <w:rFonts w:ascii="Wingdings" w:hAnsi="Wingdings" w:hint="default"/>
-        <w:sz w:val="20"/>
-      </w:rPr>
-    </w:lvl>
-    <w:lvl w:ilvl="4" w:tentative="1">
-      <w:start w:val="1"/>
-      <w:numFmt w:val="bullet"/>
-      <w:lvlText w:val=""/>
-      <w:lvlJc w:val="left"/>
-      <w:pPr>
-        <w:tabs>
-          <w:tab w:val="num" w:pos="3600"/>
-        </w:tabs>
-        <w:ind w:left="3600" w:hanging="360"/>
-      </w:pPr>
-      <w:rPr>
-        <w:rFonts w:ascii="Wingdings" w:hAnsi="Wingdings" w:hint="default"/>
-        <w:sz w:val="20"/>
-      </w:rPr>
-    </w:lvl>
-    <w:lvl w:ilvl="5" w:tentative="1">
-      <w:start w:val="1"/>
-      <w:numFmt w:val="bullet"/>
-      <w:lvlText w:val=""/>
-      <w:lvlJc w:val="left"/>
-      <w:pPr>
-        <w:tabs>
-          <w:tab w:val="num" w:pos="4320"/>
-        </w:tabs>
-        <w:ind w:left="4320" w:hanging="360"/>
-      </w:pPr>
-      <w:rPr>
-        <w:rFonts w:ascii="Wingdings" w:hAnsi="Wingdings" w:hint="default"/>
-        <w:sz w:val="20"/>
-      </w:rPr>
-    </w:lvl>
-    <w:lvl w:ilvl="6" w:tentative="1">
-      <w:start w:val="1"/>
-      <w:numFmt w:val="bullet"/>
-      <w:lvlText w:val=""/>
-      <w:lvlJc w:val="left"/>
-      <w:pPr>
-        <w:tabs>
-          <w:tab w:val="num" w:pos="5040"/>
-        </w:tabs>
-        <w:ind w:left="5040" w:hanging="360"/>
-      </w:pPr>
-      <w:rPr>
-        <w:rFonts w:ascii="Wingdings" w:hAnsi="Wingdings" w:hint="default"/>
-        <w:sz w:val="20"/>
-      </w:rPr>
-    </w:lvl>
-    <w:lvl w:ilvl="7" w:tentative="1">
-      <w:start w:val="1"/>
-      <w:numFmt w:val="bullet"/>
-      <w:lvlText w:val=""/>
-      <w:lvlJc w:val="left"/>
-      <w:pPr>
-        <w:tabs>
-          <w:tab w:val="num" w:pos="5760"/>
-        </w:tabs>
-        <w:ind w:left="5760" w:hanging="360"/>
-      </w:pPr>
-      <w:rPr>
-        <w:rFonts w:ascii="Wingdings" w:hAnsi="Wingdings" w:hint="default"/>
-        <w:sz w:val="20"/>
-      </w:rPr>
-    </w:lvl>
-    <w:lvl w:ilvl="8" w:tentative="1">
-      <w:start w:val="1"/>
-      <w:numFmt w:val="bullet"/>
-      <w:lvlText w:val=""/>
-      <w:lvlJc w:val="left"/>
-      <w:pPr>
-        <w:tabs>
-          <w:tab w:val="num" w:pos="6480"/>
-        </w:tabs>
-        <w:ind w:left="6480" w:hanging="360"/>
-      </w:pPr>
-      <w:rPr>
-        <w:rFonts w:ascii="Wingdings" w:hAnsi="Wingdings" w:hint="default"/>
-        <w:sz w:val="20"/>
-      </w:rPr>
-    </w:lvl>
-  </w:abstractNum>
-  <w:abstractNum w:abstractNumId="18" w15:restartNumberingAfterBreak="0">
-    <w:nsid w:val="7AC06E26"/>
-    <w:multiLevelType w:val="multilevel"/>
-    <w:tmpl w:val="145EB542"/>
-    <w:lvl w:ilvl="0">
-      <w:start w:val="1"/>
-      <w:numFmt w:val="bullet"/>
-      <w:lvlText w:val=""/>
-      <w:lvlJc w:val="left"/>
-      <w:pPr>
-        <w:tabs>
-          <w:tab w:val="num" w:pos="720"/>
-        </w:tabs>
-        <w:ind w:left="720" w:hanging="360"/>
-      </w:pPr>
-      <w:rPr>
-        <w:rFonts w:ascii="Symbol" w:hAnsi="Symbol" w:hint="default"/>
-        <w:sz w:val="20"/>
-      </w:rPr>
-    </w:lvl>
-    <w:lvl w:ilvl="1" w:tentative="1">
-      <w:start w:val="1"/>
-      <w:numFmt w:val="bullet"/>
-      <w:lvlText w:val="o"/>
-      <w:lvlJc w:val="left"/>
-      <w:pPr>
-        <w:tabs>
-          <w:tab w:val="num" w:pos="1440"/>
-        </w:tabs>
-        <w:ind w:left="1440" w:hanging="360"/>
-      </w:pPr>
-      <w:rPr>
-        <w:rFonts w:ascii="Courier New" w:hAnsi="Courier New" w:hint="default"/>
-        <w:sz w:val="20"/>
-      </w:rPr>
-    </w:lvl>
-    <w:lvl w:ilvl="2" w:tentative="1">
-      <w:start w:val="1"/>
-      <w:numFmt w:val="bullet"/>
-      <w:lvlText w:val=""/>
-      <w:lvlJc w:val="left"/>
-      <w:pPr>
-        <w:tabs>
-          <w:tab w:val="num" w:pos="2160"/>
-        </w:tabs>
-        <w:ind w:left="2160" w:hanging="360"/>
-      </w:pPr>
-      <w:rPr>
-        <w:rFonts w:ascii="Wingdings" w:hAnsi="Wingdings" w:hint="default"/>
-        <w:sz w:val="20"/>
-      </w:rPr>
-    </w:lvl>
-    <w:lvl w:ilvl="3" w:tentative="1">
-      <w:start w:val="1"/>
-      <w:numFmt w:val="bullet"/>
-      <w:lvlText w:val=""/>
-      <w:lvlJc w:val="left"/>
-      <w:pPr>
-        <w:tabs>
-          <w:tab w:val="num" w:pos="2880"/>
-        </w:tabs>
-        <w:ind w:left="2880" w:hanging="360"/>
-      </w:pPr>
-      <w:rPr>
-        <w:rFonts w:ascii="Wingdings" w:hAnsi="Wingdings" w:hint="default"/>
-        <w:sz w:val="20"/>
-      </w:rPr>
-    </w:lvl>
-    <w:lvl w:ilvl="4" w:tentative="1">
-      <w:start w:val="1"/>
-      <w:numFmt w:val="bullet"/>
-      <w:lvlText w:val=""/>
-      <w:lvlJc w:val="left"/>
-      <w:pPr>
-        <w:tabs>
-          <w:tab w:val="num" w:pos="3600"/>
-        </w:tabs>
-        <w:ind w:left="3600" w:hanging="360"/>
-      </w:pPr>
-      <w:rPr>
-        <w:rFonts w:ascii="Wingdings" w:hAnsi="Wingdings" w:hint="default"/>
-        <w:sz w:val="20"/>
-      </w:rPr>
-    </w:lvl>
-    <w:lvl w:ilvl="5" w:tentative="1">
-      <w:start w:val="1"/>
-      <w:numFmt w:val="bullet"/>
-      <w:lvlText w:val=""/>
-      <w:lvlJc w:val="left"/>
-      <w:pPr>
-        <w:tabs>
-          <w:tab w:val="num" w:pos="4320"/>
-        </w:tabs>
-        <w:ind w:left="4320" w:hanging="360"/>
-      </w:pPr>
-      <w:rPr>
-        <w:rFonts w:ascii="Wingdings" w:hAnsi="Wingdings" w:hint="default"/>
-        <w:sz w:val="20"/>
-      </w:rPr>
-    </w:lvl>
-    <w:lvl w:ilvl="6" w:tentative="1">
-      <w:start w:val="1"/>
-      <w:numFmt w:val="bullet"/>
-      <w:lvlText w:val=""/>
-      <w:lvlJc w:val="left"/>
-      <w:pPr>
-        <w:tabs>
-          <w:tab w:val="num" w:pos="5040"/>
-        </w:tabs>
-        <w:ind w:left="5040" w:hanging="360"/>
-      </w:pPr>
-      <w:rPr>
-        <w:rFonts w:ascii="Wingdings" w:hAnsi="Wingdings" w:hint="default"/>
-        <w:sz w:val="20"/>
-      </w:rPr>
-    </w:lvl>
-    <w:lvl w:ilvl="7" w:tentative="1">
-      <w:start w:val="1"/>
-      <w:numFmt w:val="bullet"/>
-      <w:lvlText w:val=""/>
-      <w:lvlJc w:val="left"/>
-      <w:pPr>
-        <w:tabs>
-          <w:tab w:val="num" w:pos="5760"/>
-        </w:tabs>
-        <w:ind w:left="5760" w:hanging="360"/>
-      </w:pPr>
-      <w:rPr>
-        <w:rFonts w:ascii="Wingdings" w:hAnsi="Wingdings" w:hint="default"/>
-        <w:sz w:val="20"/>
-      </w:rPr>
-    </w:lvl>
-    <w:lvl w:ilvl="8" w:tentative="1">
-      <w:start w:val="1"/>
-      <w:numFmt w:val="bullet"/>
-      <w:lvlText w:val=""/>
-      <w:lvlJc w:val="left"/>
-      <w:pPr>
-        <w:tabs>
-          <w:tab w:val="num" w:pos="6480"/>
-        </w:tabs>
-        <w:ind w:left="6480" w:hanging="360"/>
-      </w:pPr>
-      <w:rPr>
-        <w:rFonts w:ascii="Wingdings" w:hAnsi="Wingdings" w:hint="default"/>
-        <w:sz w:val="20"/>
-      </w:rPr>
-    </w:lvl>
-  </w:abstractNum>
-  <w:num w:numId="1" w16cid:durableId="1709883">
+  <w:num w:numId="1" w16cid:durableId="1464734352">
+    <w:abstractNumId w:val="8"/>
+  </w:num>
+  <w:num w:numId="2" w16cid:durableId="605891874">
+    <w:abstractNumId w:val="13"/>
+  </w:num>
+  <w:num w:numId="3" w16cid:durableId="2115901418">
+    <w:abstractNumId w:val="6"/>
+  </w:num>
+  <w:num w:numId="4" w16cid:durableId="805396475">
+    <w:abstractNumId w:val="5"/>
+  </w:num>
+  <w:num w:numId="5" w16cid:durableId="54403414">
+    <w:abstractNumId w:val="0"/>
+  </w:num>
+  <w:num w:numId="6" w16cid:durableId="532886870">
+    <w:abstractNumId w:val="4"/>
+  </w:num>
+  <w:num w:numId="7" w16cid:durableId="2105419707">
+    <w:abstractNumId w:val="11"/>
+  </w:num>
+  <w:num w:numId="8" w16cid:durableId="632711224">
+    <w:abstractNumId w:val="14"/>
+  </w:num>
+  <w:num w:numId="9" w16cid:durableId="559874534">
+    <w:abstractNumId w:val="12"/>
+  </w:num>
+  <w:num w:numId="10" w16cid:durableId="717896110">
     <w:abstractNumId w:val="1"/>
   </w:num>
-  <w:num w:numId="2" w16cid:durableId="203098864">
+  <w:num w:numId="11" w16cid:durableId="1854488549">
+    <w:abstractNumId w:val="16"/>
+  </w:num>
+  <w:num w:numId="12" w16cid:durableId="1177959753">
+    <w:abstractNumId w:val="15"/>
+  </w:num>
+  <w:num w:numId="13" w16cid:durableId="489641261">
+    <w:abstractNumId w:val="9"/>
+  </w:num>
+  <w:num w:numId="14" w16cid:durableId="559751471">
+    <w:abstractNumId w:val="18"/>
+  </w:num>
+  <w:num w:numId="15" w16cid:durableId="745688941">
+    <w:abstractNumId w:val="3"/>
+  </w:num>
+  <w:num w:numId="16" w16cid:durableId="1715692153">
+    <w:abstractNumId w:val="7"/>
+  </w:num>
+  <w:num w:numId="17" w16cid:durableId="2013406754">
+    <w:abstractNumId w:val="17"/>
+  </w:num>
+  <w:num w:numId="18" w16cid:durableId="1759792237">
     <w:abstractNumId w:val="2"/>
   </w:num>
-  <w:num w:numId="3" w16cid:durableId="767848196">
-    <w:abstractNumId w:val="7"/>
-  </w:num>
-  <w:num w:numId="4" w16cid:durableId="619722638">
-    <w:abstractNumId w:val="8"/>
-  </w:num>
-  <w:num w:numId="5" w16cid:durableId="1410998128">
-    <w:abstractNumId w:val="3"/>
-  </w:num>
-  <w:num w:numId="6" w16cid:durableId="1817448114">
+  <w:num w:numId="19" w16cid:durableId="8874854">
     <w:abstractNumId w:val="10"/>
-  </w:num>
-  <w:num w:numId="7" w16cid:durableId="506287015">
-    <w:abstractNumId w:val="13"/>
-  </w:num>
-  <w:num w:numId="8" w16cid:durableId="2091534156">
-    <w:abstractNumId w:val="17"/>
-  </w:num>
-  <w:num w:numId="9" w16cid:durableId="402073200">
-    <w:abstractNumId w:val="18"/>
-  </w:num>
-  <w:num w:numId="10" w16cid:durableId="1490512397">
-    <w:abstractNumId w:val="9"/>
-  </w:num>
-  <w:num w:numId="11" w16cid:durableId="668489073">
-    <w:abstractNumId w:val="5"/>
-  </w:num>
-  <w:num w:numId="12" w16cid:durableId="1212497799">
-    <w:abstractNumId w:val="0"/>
-  </w:num>
-  <w:num w:numId="13" w16cid:durableId="688917408">
-    <w:abstractNumId w:val="12"/>
-  </w:num>
-  <w:num w:numId="14" w16cid:durableId="202789511">
-    <w:abstractNumId w:val="6"/>
-  </w:num>
-  <w:num w:numId="15" w16cid:durableId="652025907">
-    <w:abstractNumId w:val="4"/>
-  </w:num>
-  <w:num w:numId="16" w16cid:durableId="1152331284">
-    <w:abstractNumId w:val="15"/>
-  </w:num>
-  <w:num w:numId="17" w16cid:durableId="431097958">
-    <w:abstractNumId w:val="14"/>
-  </w:num>
-  <w:num w:numId="18" w16cid:durableId="1650482020">
-    <w:abstractNumId w:val="11"/>
-  </w:num>
-  <w:num w:numId="19" w16cid:durableId="2061516674">
-    <w:abstractNumId w:val="16"/>
   </w:num>
 </w:numbering>
 </file>
@@ -12291,7 +12282,7 @@
     <w:link w:val="SidehovedTegn"/>
     <w:uiPriority w:val="99"/>
     <w:unhideWhenUsed/>
-    <w:rsid w:val="005E2A13"/>
+    <w:rsid w:val="00072BB4"/>
     <w:pPr>
       <w:tabs>
         <w:tab w:val="center" w:pos="4819"/>
@@ -12304,7 +12295,7 @@
     <w:basedOn w:val="Standardskrifttypeiafsnit"/>
     <w:link w:val="Sidehoved"/>
     <w:uiPriority w:val="99"/>
-    <w:rsid w:val="005E2A13"/>
+    <w:rsid w:val="00072BB4"/>
     <w:rPr>
       <w:rFonts w:eastAsiaTheme="minorEastAsia"/>
       <w:sz w:val="24"/>
@@ -12317,7 +12308,7 @@
     <w:link w:val="SidefodTegn"/>
     <w:uiPriority w:val="99"/>
     <w:unhideWhenUsed/>
-    <w:rsid w:val="005E2A13"/>
+    <w:rsid w:val="00072BB4"/>
     <w:pPr>
       <w:tabs>
         <w:tab w:val="center" w:pos="4819"/>
@@ -12330,7 +12321,7 @@
     <w:basedOn w:val="Standardskrifttypeiafsnit"/>
     <w:link w:val="Sidefod"/>
     <w:uiPriority w:val="99"/>
-    <w:rsid w:val="005E2A13"/>
+    <w:rsid w:val="00072BB4"/>
     <w:rPr>
       <w:rFonts w:eastAsiaTheme="minorEastAsia"/>
       <w:sz w:val="24"/>
@@ -12343,7 +12334,7 @@
     <w:uiPriority w:val="99"/>
     <w:semiHidden/>
     <w:unhideWhenUsed/>
-    <w:rsid w:val="005E2A13"/>
+    <w:rsid w:val="00072BB4"/>
   </w:style>
 </w:styles>
 </file>

</xml_diff>